<commit_message>
Update Lab 4 instruction for Session 2 v9
</commit_message>
<xml_diff>
--- a/Lab4_Instruction.docx
+++ b/Lab4_Instruction.docx
@@ -4,6 +4,7 @@
   <w:body>
     <w:p>
       <w:pPr>
+        <w:spacing w:after="40"/>
         <w:jc w:val="center"/>
       </w:pPr>
       <w:r>
@@ -17,56 +18,70 @@
     </w:p>
     <w:p>
       <w:pPr>
+        <w:spacing w:after="80"/>
         <w:jc w:val="center"/>
       </w:pPr>
       <w:r>
         <w:rPr>
+          <w:rFonts w:ascii="Aptos Display" w:hAnsi="Aptos Display"/>
           <w:b/>
-          <w:sz w:val="34"/>
+          <w:sz w:val="33"/>
         </w:rPr>
-        <w:t>Training and Deploying a Megalopa Detection Model on Raspberry Pi 5</w:t>
+        <w:t>Training, Validating, and Deploying a Megalopa Detection Model on Raspberry Pi 5</w:t>
       </w:r>
     </w:p>
     <w:p>
       <w:pPr>
+        <w:spacing w:after="200"/>
         <w:jc w:val="center"/>
       </w:pPr>
       <w:r>
         <w:rPr>
           <w:i/>
-          <w:sz w:val="22"/>
+          <w:sz w:val="20"/>
         </w:rPr>
-        <w:t>Fork-based GitHub workflow | Google Colab | YOLO26n | USB webcam</w:t>
+        <w:t>Fork-based GitHub workflow | Google Colab | YOLO26n | Static image, recorded video, and USB webcam</w:t>
       </w:r>
     </w:p>
-    <w:p/>
     <w:tbl>
       <w:tblPr>
         <w:tblStyle w:val="TableGrid"/>
         <w:tblW w:type="auto" w:w="0"/>
-        <w:jc w:val="center"/>
+        <w:tblLayout w:type="fixed"/>
         <w:tblLook w:firstColumn="1" w:firstRow="1" w:lastColumn="0" w:lastRow="0" w:noHBand="0" w:noVBand="1" w:val="04A0"/>
       </w:tblPr>
       <w:tblGrid>
-        <w:gridCol w:w="2520"/>
-        <w:gridCol w:w="2520"/>
-        <w:gridCol w:w="2520"/>
-        <w:gridCol w:w="2520"/>
+        <w:gridCol w:w="2592"/>
+        <w:gridCol w:w="2592"/>
+        <w:gridCol w:w="2592"/>
+        <w:gridCol w:w="2592"/>
       </w:tblGrid>
       <w:tr>
         <w:trPr>
+          <w:trHeight w:hRule="atLeast"/>
           <w:tblHeader w:val="true"/>
         </w:trPr>
         <w:tc>
           <w:tcPr>
-            <w:tcW w:type="dxa" w:w="1584"/>
+            <w:tcW w:type="dxa" w:w="1051560"/>
+            <w:vAlign w:val="center"/>
+            <w:tcMar>
+              <w:top w:w="45" w:type="dxa"/>
+              <w:start w:w="65" w:type="dxa"/>
+              <w:bottom w:w="45" w:type="dxa"/>
+              <w:end w:w="65" w:type="dxa"/>
+            </w:tcMar>
             <w:shd w:fill="D9EAF7"/>
-            <w:vAlign w:val="center"/>
           </w:tcPr>
           <w:p>
+            <w:pPr>
+              <w:spacing w:after="0" w:before="0" w:line="228" w:lineRule="auto"/>
+            </w:pPr>
             <w:r>
               <w:rPr>
+                <w:rFonts w:ascii="Aptos" w:hAnsi="Aptos"/>
                 <w:b/>
+                <w:sz w:val="17"/>
               </w:rPr>
               <w:t>Session</w:t>
             </w:r>
@@ -74,14 +89,25 @@
         </w:tc>
         <w:tc>
           <w:tcPr>
-            <w:tcW w:type="dxa" w:w="1440"/>
+            <w:tcW w:type="dxa" w:w="960120"/>
+            <w:vAlign w:val="center"/>
+            <w:tcMar>
+              <w:top w:w="45" w:type="dxa"/>
+              <w:start w:w="65" w:type="dxa"/>
+              <w:bottom w:w="45" w:type="dxa"/>
+              <w:end w:w="65" w:type="dxa"/>
+            </w:tcMar>
             <w:shd w:fill="D9EAF7"/>
-            <w:vAlign w:val="center"/>
           </w:tcPr>
           <w:p>
+            <w:pPr>
+              <w:spacing w:after="0" w:before="0" w:line="228" w:lineRule="auto"/>
+            </w:pPr>
             <w:r>
               <w:rPr>
+                <w:rFonts w:ascii="Aptos" w:hAnsi="Aptos"/>
                 <w:b/>
+                <w:sz w:val="17"/>
               </w:rPr>
               <w:t>Duration</w:t>
             </w:r>
@@ -89,14 +115,25 @@
         </w:tc>
         <w:tc>
           <w:tcPr>
-            <w:tcW w:type="dxa" w:w="6624"/>
+            <w:tcW w:type="dxa" w:w="4617720"/>
+            <w:vAlign w:val="center"/>
+            <w:tcMar>
+              <w:top w:w="45" w:type="dxa"/>
+              <w:start w:w="65" w:type="dxa"/>
+              <w:bottom w:w="45" w:type="dxa"/>
+              <w:end w:w="65" w:type="dxa"/>
+            </w:tcMar>
             <w:shd w:fill="D9EAF7"/>
-            <w:vAlign w:val="center"/>
           </w:tcPr>
           <w:p>
+            <w:pPr>
+              <w:spacing w:after="0" w:before="0" w:line="228" w:lineRule="auto"/>
+            </w:pPr>
             <w:r>
               <w:rPr>
+                <w:rFonts w:ascii="Aptos" w:hAnsi="Aptos"/>
                 <w:b/>
+                <w:sz w:val="17"/>
               </w:rPr>
               <w:t>Focus</w:t>
             </w:r>
@@ -104,14 +141,25 @@
         </w:tc>
         <w:tc>
           <w:tcPr>
-            <w:tcW w:type="dxa" w:w="1008"/>
+            <w:tcW w:type="dxa" w:w="685800"/>
+            <w:vAlign w:val="center"/>
+            <w:tcMar>
+              <w:top w:w="45" w:type="dxa"/>
+              <w:start w:w="65" w:type="dxa"/>
+              <w:bottom w:w="45" w:type="dxa"/>
+              <w:end w:w="65" w:type="dxa"/>
+            </w:tcMar>
             <w:shd w:fill="D9EAF7"/>
-            <w:vAlign w:val="center"/>
           </w:tcPr>
           <w:p>
+            <w:pPr>
+              <w:spacing w:after="0" w:before="0" w:line="228" w:lineRule="auto"/>
+            </w:pPr>
             <w:r>
               <w:rPr>
+                <w:rFonts w:ascii="Aptos" w:hAnsi="Aptos"/>
                 <w:b/>
+                <w:sz w:val="17"/>
               </w:rPr>
               <w:t>Marks</w:t>
             </w:r>
@@ -119,146 +167,313 @@
         </w:tc>
       </w:tr>
       <w:tr>
+        <w:trPr>
+          <w:trHeight w:hRule="atLeast"/>
+        </w:trPr>
         <w:tc>
           <w:tcPr>
-            <w:tcW w:type="dxa" w:w="1584"/>
+            <w:tcW w:type="dxa" w:w="1051560"/>
             <w:vAlign w:val="center"/>
+            <w:tcMar>
+              <w:top w:w="45" w:type="dxa"/>
+              <w:start w:w="65" w:type="dxa"/>
+              <w:bottom w:w="45" w:type="dxa"/>
+              <w:end w:w="65" w:type="dxa"/>
+            </w:tcMar>
           </w:tcPr>
           <w:p>
+            <w:pPr>
+              <w:spacing w:after="0" w:before="0" w:line="228" w:lineRule="auto"/>
+            </w:pPr>
             <w:r>
+              <w:rPr>
+                <w:rFonts w:ascii="Aptos" w:hAnsi="Aptos"/>
+                <w:sz w:val="17"/>
+              </w:rPr>
               <w:t>Session 1</w:t>
             </w:r>
           </w:p>
         </w:tc>
         <w:tc>
           <w:tcPr>
-            <w:tcW w:type="dxa" w:w="1440"/>
+            <w:tcW w:type="dxa" w:w="960120"/>
             <w:vAlign w:val="center"/>
+            <w:tcMar>
+              <w:top w:w="45" w:type="dxa"/>
+              <w:start w:w="65" w:type="dxa"/>
+              <w:bottom w:w="45" w:type="dxa"/>
+              <w:end w:w="65" w:type="dxa"/>
+            </w:tcMar>
           </w:tcPr>
           <w:p>
+            <w:pPr>
+              <w:spacing w:after="0" w:before="0" w:line="228" w:lineRule="auto"/>
+            </w:pPr>
             <w:r>
+              <w:rPr>
+                <w:rFonts w:ascii="Aptos" w:hAnsi="Aptos"/>
+                <w:sz w:val="17"/>
+              </w:rPr>
               <w:t>2 hours</w:t>
             </w:r>
           </w:p>
         </w:tc>
         <w:tc>
           <w:tcPr>
-            <w:tcW w:type="dxa" w:w="6624"/>
+            <w:tcW w:type="dxa" w:w="4617720"/>
             <w:vAlign w:val="center"/>
+            <w:tcMar>
+              <w:top w:w="45" w:type="dxa"/>
+              <w:start w:w="65" w:type="dxa"/>
+              <w:bottom w:w="45" w:type="dxa"/>
+              <w:end w:w="65" w:type="dxa"/>
+            </w:tcMar>
           </w:tcPr>
           <w:p>
+            <w:pPr>
+              <w:spacing w:after="0" w:before="0" w:line="228" w:lineRule="auto"/>
+            </w:pPr>
             <w:r>
-              <w:t>Fork, dataset, training, evaluation, ONNX export, Git push</w:t>
+              <w:rPr>
+                <w:rFonts w:ascii="Aptos" w:hAnsi="Aptos"/>
+                <w:sz w:val="17"/>
+              </w:rPr>
+              <w:t>Fork, dataset inspection, training, evaluation, ONNX export, and Git push</w:t>
             </w:r>
           </w:p>
         </w:tc>
         <w:tc>
           <w:tcPr>
-            <w:tcW w:type="dxa" w:w="1008"/>
+            <w:tcW w:type="dxa" w:w="685800"/>
             <w:vAlign w:val="center"/>
+            <w:tcMar>
+              <w:top w:w="45" w:type="dxa"/>
+              <w:start w:w="65" w:type="dxa"/>
+              <w:bottom w:w="45" w:type="dxa"/>
+              <w:end w:w="65" w:type="dxa"/>
+            </w:tcMar>
           </w:tcPr>
           <w:p>
+            <w:pPr>
+              <w:spacing w:after="0" w:before="0" w:line="228" w:lineRule="auto"/>
+            </w:pPr>
             <w:r>
+              <w:rPr>
+                <w:rFonts w:ascii="Aptos" w:hAnsi="Aptos"/>
+                <w:sz w:val="17"/>
+              </w:rPr>
               <w:t>60</w:t>
             </w:r>
           </w:p>
         </w:tc>
       </w:tr>
       <w:tr>
+        <w:trPr>
+          <w:trHeight w:hRule="atLeast"/>
+        </w:trPr>
         <w:tc>
           <w:tcPr>
-            <w:tcW w:type="dxa" w:w="1584"/>
+            <w:tcW w:type="dxa" w:w="1051560"/>
             <w:vAlign w:val="center"/>
+            <w:tcMar>
+              <w:top w:w="45" w:type="dxa"/>
+              <w:start w:w="65" w:type="dxa"/>
+              <w:bottom w:w="45" w:type="dxa"/>
+              <w:end w:w="65" w:type="dxa"/>
+            </w:tcMar>
           </w:tcPr>
           <w:p>
+            <w:pPr>
+              <w:spacing w:after="0" w:before="0" w:line="228" w:lineRule="auto"/>
+            </w:pPr>
             <w:r>
+              <w:rPr>
+                <w:rFonts w:ascii="Aptos" w:hAnsi="Aptos"/>
+                <w:sz w:val="17"/>
+              </w:rPr>
               <w:t>Session 2</w:t>
             </w:r>
           </w:p>
         </w:tc>
         <w:tc>
           <w:tcPr>
-            <w:tcW w:type="dxa" w:w="1440"/>
+            <w:tcW w:type="dxa" w:w="960120"/>
             <w:vAlign w:val="center"/>
+            <w:tcMar>
+              <w:top w:w="45" w:type="dxa"/>
+              <w:start w:w="65" w:type="dxa"/>
+              <w:bottom w:w="45" w:type="dxa"/>
+              <w:end w:w="65" w:type="dxa"/>
+            </w:tcMar>
           </w:tcPr>
           <w:p>
+            <w:pPr>
+              <w:spacing w:after="0" w:before="0" w:line="228" w:lineRule="auto"/>
+            </w:pPr>
             <w:r>
+              <w:rPr>
+                <w:rFonts w:ascii="Aptos" w:hAnsi="Aptos"/>
+                <w:sz w:val="17"/>
+              </w:rPr>
               <w:t>2 hours</w:t>
             </w:r>
           </w:p>
         </w:tc>
         <w:tc>
           <w:tcPr>
-            <w:tcW w:type="dxa" w:w="6624"/>
+            <w:tcW w:type="dxa" w:w="4617720"/>
             <w:vAlign w:val="center"/>
+            <w:tcMar>
+              <w:top w:w="45" w:type="dxa"/>
+              <w:start w:w="65" w:type="dxa"/>
+              <w:bottom w:w="45" w:type="dxa"/>
+              <w:end w:w="65" w:type="dxa"/>
+            </w:tcMar>
           </w:tcPr>
           <w:p>
+            <w:pPr>
+              <w:spacing w:after="0" w:before="0" w:line="228" w:lineRule="auto"/>
+            </w:pPr>
             <w:r>
-              <w:t>Clone fork on Pi 5, USB-webcam inference, deployment evaluation</w:t>
+              <w:rPr>
+                <w:rFonts w:ascii="Aptos" w:hAnsi="Aptos"/>
+                <w:sz w:val="17"/>
+              </w:rPr>
+              <w:t>Fork synchronization, CPU-only Pi setup, image/video/live validation, and deployment evaluation</w:t>
             </w:r>
           </w:p>
         </w:tc>
         <w:tc>
           <w:tcPr>
-            <w:tcW w:type="dxa" w:w="1008"/>
+            <w:tcW w:type="dxa" w:w="685800"/>
             <w:vAlign w:val="center"/>
+            <w:tcMar>
+              <w:top w:w="45" w:type="dxa"/>
+              <w:start w:w="65" w:type="dxa"/>
+              <w:bottom w:w="45" w:type="dxa"/>
+              <w:end w:w="65" w:type="dxa"/>
+            </w:tcMar>
           </w:tcPr>
           <w:p>
+            <w:pPr>
+              <w:spacing w:after="0" w:before="0" w:line="228" w:lineRule="auto"/>
+            </w:pPr>
             <w:r>
+              <w:rPr>
+                <w:rFonts w:ascii="Aptos" w:hAnsi="Aptos"/>
+                <w:sz w:val="17"/>
+              </w:rPr>
               <w:t>40</w:t>
             </w:r>
           </w:p>
         </w:tc>
       </w:tr>
       <w:tr>
+        <w:trPr>
+          <w:trHeight w:hRule="atLeast"/>
+        </w:trPr>
         <w:tc>
           <w:tcPr>
-            <w:tcW w:type="dxa" w:w="1584"/>
+            <w:tcW w:type="dxa" w:w="1051560"/>
             <w:vAlign w:val="center"/>
+            <w:tcMar>
+              <w:top w:w="45" w:type="dxa"/>
+              <w:start w:w="65" w:type="dxa"/>
+              <w:bottom w:w="45" w:type="dxa"/>
+              <w:end w:w="65" w:type="dxa"/>
+            </w:tcMar>
           </w:tcPr>
           <w:p>
+            <w:pPr>
+              <w:spacing w:after="0" w:before="0" w:line="228" w:lineRule="auto"/>
+            </w:pPr>
             <w:r>
+              <w:rPr>
+                <w:rFonts w:ascii="Aptos" w:hAnsi="Aptos"/>
+                <w:sz w:val="17"/>
+              </w:rPr>
               <w:t>Total</w:t>
             </w:r>
           </w:p>
         </w:tc>
         <w:tc>
           <w:tcPr>
-            <w:tcW w:type="dxa" w:w="1440"/>
+            <w:tcW w:type="dxa" w:w="960120"/>
             <w:vAlign w:val="center"/>
+            <w:tcMar>
+              <w:top w:w="45" w:type="dxa"/>
+              <w:start w:w="65" w:type="dxa"/>
+              <w:bottom w:w="45" w:type="dxa"/>
+              <w:end w:w="65" w:type="dxa"/>
+            </w:tcMar>
           </w:tcPr>
           <w:p>
+            <w:pPr>
+              <w:spacing w:after="0" w:before="0" w:line="228" w:lineRule="auto"/>
+            </w:pPr>
             <w:r>
+              <w:rPr>
+                <w:rFonts w:ascii="Aptos" w:hAnsi="Aptos"/>
+                <w:sz w:val="17"/>
+              </w:rPr>
               <w:t>4 hours</w:t>
             </w:r>
           </w:p>
         </w:tc>
         <w:tc>
           <w:tcPr>
-            <w:tcW w:type="dxa" w:w="6624"/>
+            <w:tcW w:type="dxa" w:w="4617720"/>
             <w:vAlign w:val="center"/>
+            <w:tcMar>
+              <w:top w:w="45" w:type="dxa"/>
+              <w:start w:w="65" w:type="dxa"/>
+              <w:bottom w:w="45" w:type="dxa"/>
+              <w:end w:w="65" w:type="dxa"/>
+            </w:tcMar>
           </w:tcPr>
           <w:p>
+            <w:pPr>
+              <w:spacing w:after="0" w:before="0" w:line="228" w:lineRule="auto"/>
+            </w:pPr>
             <w:r>
+              <w:rPr>
+                <w:rFonts w:ascii="Aptos" w:hAnsi="Aptos"/>
+                <w:sz w:val="17"/>
+              </w:rPr>
               <w:t>Complete cloud-to-edge workflow</w:t>
             </w:r>
           </w:p>
         </w:tc>
         <w:tc>
           <w:tcPr>
-            <w:tcW w:type="dxa" w:w="1008"/>
+            <w:tcW w:type="dxa" w:w="685800"/>
             <w:vAlign w:val="center"/>
+            <w:tcMar>
+              <w:top w:w="45" w:type="dxa"/>
+              <w:start w:w="65" w:type="dxa"/>
+              <w:bottom w:w="45" w:type="dxa"/>
+              <w:end w:w="65" w:type="dxa"/>
+            </w:tcMar>
           </w:tcPr>
           <w:p>
+            <w:pPr>
+              <w:spacing w:after="0" w:before="0" w:line="228" w:lineRule="auto"/>
+            </w:pPr>
             <w:r>
+              <w:rPr>
+                <w:rFonts w:ascii="Aptos" w:hAnsi="Aptos"/>
+                <w:sz w:val="17"/>
+              </w:rPr>
               <w:t>100</w:t>
             </w:r>
           </w:p>
         </w:tc>
       </w:tr>
     </w:tbl>
-    <w:p/>
     <w:p>
+      <w:pPr>
+        <w:spacing w:before="120" w:after="120"/>
+      </w:pPr>
       <w:r>
         <w:rPr>
           <w:b/>
@@ -272,6 +487,7 @@
     <w:p>
       <w:pPr>
         <w:pStyle w:val="Heading1"/>
+        <w:keepNext/>
       </w:pPr>
       <w:r>
         <w:t>1. Laboratory objective</w:t>
@@ -279,76 +495,93 @@
     </w:p>
     <w:p>
       <w:r>
-        <w:t>Students complete a reproducible object-detection workflow from a labelled megalopa dataset to live edge inference on Raspberry Pi 5. The instructor maintains a public upstream repository, while every student group works in its own fork.</w:t>
+        <w:t>Students complete a reproducible object-detection workflow from a labelled megalopa dataset to edge inference on Raspberry Pi 5. The instructor maintains a public upstream repository, and each student group works in its own public fork.</w:t>
       </w:r>
     </w:p>
     <w:p>
       <w:pPr>
         <w:pStyle w:val="ListBullet"/>
+        <w:keepLines/>
+        <w:spacing w:after="20"/>
       </w:pPr>
       <w:r>
-        <w:t>Inspect and validate a YOLO bounding-box dataset.</w:t>
+        <w:t>Inspect and validate a YOLO bounding-box dataset and its class mapping.</w:t>
       </w:r>
     </w:p>
     <w:p>
       <w:pPr>
         <w:pStyle w:val="ListBullet"/>
+        <w:keepLines/>
+        <w:spacing w:after="20"/>
       </w:pPr>
       <w:r>
-        <w:t>Create train, validation, and test subsets.</w:t>
+        <w:t>Create train, validation, and test subsets and train a lightweight YOLO26n model in Google Colab.</w:t>
       </w:r>
     </w:p>
     <w:p>
       <w:pPr>
         <w:pStyle w:val="ListBullet"/>
+        <w:keepLines/>
+        <w:spacing w:after="20"/>
       </w:pPr>
       <w:r>
-        <w:t>Train a lightweight YOLO26n detector in Google Colab.</w:t>
+        <w:t>Interpret precision, recall, mAP, confusion matrices, and confidence-related plots.</w:t>
       </w:r>
     </w:p>
     <w:p>
       <w:pPr>
         <w:pStyle w:val="ListBullet"/>
+        <w:keepLines/>
+        <w:spacing w:after="20"/>
       </w:pPr>
       <w:r>
-        <w:t>Interpret precision, recall, mAP, confusion matrices, and confidence curves.</w:t>
+        <w:t>Export the trained PyTorch model to ONNX and push selected outputs to the group fork.</w:t>
       </w:r>
     </w:p>
     <w:p>
       <w:pPr>
         <w:pStyle w:val="ListBullet"/>
+        <w:keepLines/>
+        <w:spacing w:after="20"/>
       </w:pPr>
       <w:r>
-        <w:t>Export the trained PyTorch model to ONNX.</w:t>
+        <w:t>Synchronize the group fork with the updated instructor repository before Session 2.</w:t>
       </w:r>
     </w:p>
     <w:p>
       <w:pPr>
         <w:pStyle w:val="ListBullet"/>
+        <w:keepLines/>
+        <w:spacing w:after="20"/>
       </w:pPr>
       <w:r>
-        <w:t>Push models and selected results to the group fork.</w:t>
+        <w:t>Create a CPU-only Raspberry Pi environment and verify that CUDA is not active.</w:t>
       </w:r>
     </w:p>
     <w:p>
       <w:pPr>
         <w:pStyle w:val="ListBullet"/>
+        <w:keepLines/>
+        <w:spacing w:after="20"/>
       </w:pPr>
       <w:r>
-        <w:t>Clone the same fork on Raspberry Pi 5.</w:t>
+        <w:t>Evaluate pretrained and custom models on static images, recorded video, and a live USB webcam.</w:t>
       </w:r>
     </w:p>
     <w:p>
       <w:pPr>
         <w:pStyle w:val="ListBullet"/>
+        <w:keepLines/>
+        <w:spacing w:after="20"/>
       </w:pPr>
       <w:r>
-        <w:t>Run static and live inference using a USB webcam and local display.</w:t>
+        <w:t>Compare PyTorch and ONNX deployment behaviour under controlled settings.</w:t>
       </w:r>
     </w:p>
     <w:p>
       <w:pPr>
         <w:pStyle w:val="Heading1"/>
+        <w:keepNext/>
       </w:pPr>
       <w:r>
         <w:t>2. GitHub architecture</w:t>
@@ -361,19 +594,26 @@
     </w:p>
     <w:p>
       <w:pPr>
+        <w:spacing w:before="40" w:after="40"/>
         <w:jc w:val="center"/>
       </w:pPr>
       <w:r>
         <w:rPr>
           <w:b/>
-          <w:sz w:val="24"/>
+          <w:sz w:val="22"/>
         </w:rPr>
-        <w:t>WUStuLab upstream  →  group fork  →  Colab training/push  →  Pi 5 clone</w:t>
+        <w:t>WUStuLab upstream -&gt; group fork -&gt; Colab training/push -&gt; fork synchronization -&gt; Raspberry Pi 5 clone</w:t>
+      </w:r>
+    </w:p>
+    <w:p>
+      <w:r>
+        <w:br w:type="page"/>
       </w:r>
     </w:p>
     <w:p>
       <w:pPr>
         <w:pStyle w:val="Heading2"/>
+        <w:keepNext/>
       </w:pPr>
       <w:r>
         <w:t>2.1 Instructor upstream</w:t>
@@ -382,6 +622,8 @@
     <w:p>
       <w:pPr>
         <w:pStyle w:val="ListBullet"/>
+        <w:keepLines/>
+        <w:spacing w:after="20"/>
       </w:pPr>
       <w:r>
         <w:t>Repository: WUStuLab/lab4-megalopa.</w:t>
@@ -390,14 +632,18 @@
     <w:p>
       <w:pPr>
         <w:pStyle w:val="ListBullet"/>
+        <w:keepLines/>
+        <w:spacing w:after="20"/>
       </w:pPr>
       <w:r>
-        <w:t>Contains official dataset, validation material, notebooks, and Pi scripts.</w:t>
+        <w:t>Contains official datasets, validation media, notebooks, baseline models, and Raspberry Pi scripts.</w:t>
       </w:r>
     </w:p>
     <w:p>
       <w:pPr>
         <w:pStyle w:val="ListBullet"/>
+        <w:keepLines/>
+        <w:spacing w:after="20"/>
       </w:pPr>
       <w:r>
         <w:t>Students do not require Write access to this repository.</w:t>
@@ -406,6 +652,8 @@
     <w:p>
       <w:pPr>
         <w:pStyle w:val="ListBullet"/>
+        <w:keepLines/>
+        <w:spacing w:after="20"/>
       </w:pPr>
       <w:r>
         <w:t>The upstream main branch remains instructor-controlled.</w:t>
@@ -414,14 +662,17 @@
     <w:p>
       <w:pPr>
         <w:pStyle w:val="Heading2"/>
+        <w:keepNext/>
       </w:pPr>
       <w:r>
-        <w:t>2.2 Group fork</w:t>
+        <w:t>2.2 Group fork and synchronization rule</w:t>
       </w:r>
     </w:p>
     <w:p>
       <w:pPr>
-        <w:pStyle w:val="ListNumber"/>
+        <w:pStyle w:val="ListBullet"/>
+        <w:keepLines/>
+        <w:spacing w:after="20"/>
       </w:pPr>
       <w:r>
         <w:t>Every student must have a GitHub account.</w:t>
@@ -429,39 +680,84 @@
     </w:p>
     <w:p>
       <w:pPr>
-        <w:pStyle w:val="ListNumber"/>
+        <w:pStyle w:val="ListBullet"/>
+        <w:keepLines/>
+        <w:spacing w:after="20"/>
       </w:pPr>
       <w:r>
-        <w:t>One designated group member creates the group fork.</w:t>
+        <w:t>One designated group member creates the public group fork and adds the remaining members as collaborators.</w:t>
       </w:r>
     </w:p>
     <w:p>
       <w:pPr>
-        <w:pStyle w:val="ListNumber"/>
+        <w:pStyle w:val="ListBullet"/>
+        <w:keepLines/>
+        <w:spacing w:after="20"/>
       </w:pPr>
       <w:r>
-        <w:t>The fork owner adds the remaining group members as collaborators.</w:t>
+        <w:t>Session 1 clones and pushes to the group fork.</w:t>
       </w:r>
     </w:p>
     <w:p>
       <w:pPr>
-        <w:pStyle w:val="ListNumber"/>
+        <w:pStyle w:val="ListBullet"/>
+        <w:keepLines/>
+        <w:spacing w:after="20"/>
       </w:pPr>
       <w:r>
-        <w:t>Session 1 clones and pushes to this fork.</w:t>
+        <w:t>Student-generated files must be stored under student_work/.</w:t>
       </w:r>
     </w:p>
     <w:p>
       <w:pPr>
-        <w:pStyle w:val="ListNumber"/>
+        <w:pStyle w:val="ListBullet"/>
+        <w:keepLines/>
+        <w:spacing w:after="20"/>
       </w:pPr>
       <w:r>
-        <w:t>Session 2 clones the same fork on Raspberry Pi 5.</w:t>
+        <w:t>Before Session 2, the group selects Sync fork -&gt; Update branch on GitHub.</w:t>
+      </w:r>
+    </w:p>
+    <w:p>
+      <w:pPr>
+        <w:pStyle w:val="ListBullet"/>
+        <w:keepLines/>
+        <w:spacing w:after="20"/>
+      </w:pPr>
+      <w:r>
+        <w:t>Session 2 clones the synchronized group fork on Raspberry Pi 5.</w:t>
+      </w:r>
+    </w:p>
+    <w:p>
+      <w:pPr>
+        <w:pStyle w:val="ListBullet"/>
+        <w:keepLines/>
+        <w:spacing w:after="20"/>
+      </w:pPr>
+      <w:r>
+        <w:t>Files under shared/ are instructor-managed and should not be edited by students.</w:t>
+      </w:r>
+    </w:p>
+    <w:p>
+      <w:pPr>
+        <w:keepLines/>
+        <w:spacing w:before="60" w:after="80"/>
+      </w:pPr>
+      <w:r>
+        <w:rPr>
+          <w:b/>
+          <w:color w:val="C0504D"/>
+        </w:rPr>
+        <w:t xml:space="preserve">Commit traceability: </w:t>
+      </w:r>
+      <w:r>
+        <w:t>Record the Session 1 training commit and the newer synchronized Session 2 commit. After upstream synchronization, the fork HEAD may no longer equal the original Session 1 commit.</w:t>
       </w:r>
     </w:p>
     <w:p>
       <w:pPr>
         <w:pStyle w:val="Heading1"/>
+        <w:keepNext/>
       </w:pPr>
       <w:r>
         <w:t>3. Material supplied through Google Classroom/GitHub</w:t>
@@ -471,27 +767,39 @@
       <w:tblPr>
         <w:tblStyle w:val="TableGrid"/>
         <w:tblW w:type="auto" w:w="0"/>
-        <w:jc w:val="center"/>
+        <w:tblLayout w:type="fixed"/>
         <w:tblLook w:firstColumn="1" w:firstRow="1" w:lastColumn="0" w:lastRow="0" w:noHBand="0" w:noVBand="1" w:val="04A0"/>
       </w:tblPr>
       <w:tblGrid>
-        <w:gridCol w:w="5040"/>
-        <w:gridCol w:w="5040"/>
+        <w:gridCol w:w="5184"/>
+        <w:gridCol w:w="5184"/>
       </w:tblGrid>
       <w:tr>
         <w:trPr>
+          <w:trHeight w:hRule="atLeast"/>
           <w:tblHeader w:val="true"/>
         </w:trPr>
         <w:tc>
           <w:tcPr>
-            <w:tcW w:type="dxa" w:w="3600"/>
+            <w:tcW w:type="dxa" w:w="2743200"/>
+            <w:vAlign w:val="center"/>
+            <w:tcMar>
+              <w:top w:w="45" w:type="dxa"/>
+              <w:start w:w="65" w:type="dxa"/>
+              <w:bottom w:w="45" w:type="dxa"/>
+              <w:end w:w="65" w:type="dxa"/>
+            </w:tcMar>
             <w:shd w:fill="D9EAF7"/>
-            <w:vAlign w:val="center"/>
           </w:tcPr>
           <w:p>
+            <w:pPr>
+              <w:spacing w:after="0" w:before="0" w:line="228" w:lineRule="auto"/>
+            </w:pPr>
             <w:r>
               <w:rPr>
+                <w:rFonts w:ascii="Aptos" w:hAnsi="Aptos"/>
                 <w:b/>
+                <w:sz w:val="17"/>
               </w:rPr>
               <w:t>Material</w:t>
             </w:r>
@@ -499,14 +807,25 @@
         </w:tc>
         <w:tc>
           <w:tcPr>
-            <w:tcW w:type="dxa" w:w="7200"/>
+            <w:tcW w:type="dxa" w:w="4572000"/>
+            <w:vAlign w:val="center"/>
+            <w:tcMar>
+              <w:top w:w="45" w:type="dxa"/>
+              <w:start w:w="65" w:type="dxa"/>
+              <w:bottom w:w="45" w:type="dxa"/>
+              <w:end w:w="65" w:type="dxa"/>
+            </w:tcMar>
             <w:shd w:fill="D9EAF7"/>
-            <w:vAlign w:val="center"/>
           </w:tcPr>
           <w:p>
+            <w:pPr>
+              <w:spacing w:after="0" w:before="0" w:line="228" w:lineRule="auto"/>
+            </w:pPr>
             <w:r>
               <w:rPr>
+                <w:rFonts w:ascii="Aptos" w:hAnsi="Aptos"/>
                 <w:b/>
+                <w:sz w:val="17"/>
               </w:rPr>
               <w:t>Purpose</w:t>
             </w:r>
@@ -514,178 +833,487 @@
         </w:tc>
       </w:tr>
       <w:tr>
+        <w:trPr>
+          <w:trHeight w:hRule="atLeast"/>
+        </w:trPr>
         <w:tc>
           <w:tcPr>
-            <w:tcW w:type="dxa" w:w="3600"/>
+            <w:tcW w:type="dxa" w:w="2743200"/>
             <w:vAlign w:val="center"/>
+            <w:tcMar>
+              <w:top w:w="45" w:type="dxa"/>
+              <w:start w:w="65" w:type="dxa"/>
+              <w:bottom w:w="45" w:type="dxa"/>
+              <w:end w:w="65" w:type="dxa"/>
+            </w:tcMar>
           </w:tcPr>
           <w:p>
+            <w:pPr>
+              <w:spacing w:after="0" w:before="0" w:line="228" w:lineRule="auto"/>
+            </w:pPr>
             <w:r>
-              <w:t>Lab4_Instruction.pdf</w:t>
+              <w:rPr>
+                <w:rFonts w:ascii="Aptos" w:hAnsi="Aptos"/>
+                <w:sz w:val="17"/>
+              </w:rPr>
+              <w:t>Lab4_Instruction.docx / .pdf</w:t>
             </w:r>
           </w:p>
         </w:tc>
         <w:tc>
           <w:tcPr>
-            <w:tcW w:type="dxa" w:w="7200"/>
+            <w:tcW w:type="dxa" w:w="4572000"/>
             <w:vAlign w:val="center"/>
+            <w:tcMar>
+              <w:top w:w="45" w:type="dxa"/>
+              <w:start w:w="65" w:type="dxa"/>
+              <w:bottom w:w="45" w:type="dxa"/>
+              <w:end w:w="65" w:type="dxa"/>
+            </w:tcMar>
           </w:tcPr>
           <w:p>
+            <w:pPr>
+              <w:spacing w:after="0" w:before="0" w:line="228" w:lineRule="auto"/>
+            </w:pPr>
             <w:r>
+              <w:rPr>
+                <w:rFonts w:ascii="Aptos" w:hAnsi="Aptos"/>
+                <w:sz w:val="17"/>
+              </w:rPr>
               <w:t>Complete two-session laboratory instruction</w:t>
             </w:r>
           </w:p>
         </w:tc>
       </w:tr>
       <w:tr>
+        <w:trPr>
+          <w:trHeight w:hRule="atLeast"/>
+        </w:trPr>
         <w:tc>
           <w:tcPr>
-            <w:tcW w:type="dxa" w:w="3600"/>
+            <w:tcW w:type="dxa" w:w="2743200"/>
             <w:vAlign w:val="center"/>
+            <w:tcMar>
+              <w:top w:w="45" w:type="dxa"/>
+              <w:start w:w="65" w:type="dxa"/>
+              <w:bottom w:w="45" w:type="dxa"/>
+              <w:end w:w="65" w:type="dxa"/>
+            </w:tcMar>
           </w:tcPr>
           <w:p>
+            <w:pPr>
+              <w:spacing w:after="0" w:before="0" w:line="228" w:lineRule="auto"/>
+            </w:pPr>
             <w:r>
+              <w:rPr>
+                <w:rFonts w:ascii="Aptos" w:hAnsi="Aptos"/>
+                <w:sz w:val="17"/>
+              </w:rPr>
               <w:t>Session 1 Colab notebook</w:t>
             </w:r>
           </w:p>
         </w:tc>
         <w:tc>
           <w:tcPr>
-            <w:tcW w:type="dxa" w:w="7200"/>
+            <w:tcW w:type="dxa" w:w="4572000"/>
             <w:vAlign w:val="center"/>
+            <w:tcMar>
+              <w:top w:w="45" w:type="dxa"/>
+              <w:start w:w="65" w:type="dxa"/>
+              <w:bottom w:w="45" w:type="dxa"/>
+              <w:end w:w="65" w:type="dxa"/>
+            </w:tcMar>
           </w:tcPr>
           <w:p>
+            <w:pPr>
+              <w:spacing w:after="0" w:before="0" w:line="228" w:lineRule="auto"/>
+            </w:pPr>
             <w:r>
-              <w:t>Training, evaluation, export, answers, and PDF evidence</w:t>
+              <w:rPr>
+                <w:rFonts w:ascii="Aptos" w:hAnsi="Aptos"/>
+                <w:sz w:val="17"/>
+              </w:rPr>
+              <w:t>Dataset inspection, training, evaluation, export, answers, and PDF evidence</w:t>
             </w:r>
           </w:p>
         </w:tc>
       </w:tr>
       <w:tr>
+        <w:trPr>
+          <w:trHeight w:hRule="atLeast"/>
+        </w:trPr>
         <w:tc>
           <w:tcPr>
-            <w:tcW w:type="dxa" w:w="3600"/>
+            <w:tcW w:type="dxa" w:w="2743200"/>
             <w:vAlign w:val="center"/>
+            <w:tcMar>
+              <w:top w:w="45" w:type="dxa"/>
+              <w:start w:w="65" w:type="dxa"/>
+              <w:bottom w:w="45" w:type="dxa"/>
+              <w:end w:w="65" w:type="dxa"/>
+            </w:tcMar>
           </w:tcPr>
           <w:p>
+            <w:pPr>
+              <w:spacing w:after="0" w:before="0" w:line="228" w:lineRule="auto"/>
+            </w:pPr>
             <w:r>
+              <w:rPr>
+                <w:rFonts w:ascii="Aptos" w:hAnsi="Aptos"/>
+                <w:sz w:val="17"/>
+              </w:rPr>
               <w:t>Session 2 Colab notebook</w:t>
             </w:r>
           </w:p>
         </w:tc>
         <w:tc>
           <w:tcPr>
-            <w:tcW w:type="dxa" w:w="7200"/>
+            <w:tcW w:type="dxa" w:w="4572000"/>
             <w:vAlign w:val="center"/>
+            <w:tcMar>
+              <w:top w:w="45" w:type="dxa"/>
+              <w:start w:w="65" w:type="dxa"/>
+              <w:bottom w:w="45" w:type="dxa"/>
+              <w:end w:w="65" w:type="dxa"/>
+            </w:tcMar>
           </w:tcPr>
           <w:p>
+            <w:pPr>
+              <w:spacing w:after="0" w:before="0" w:line="228" w:lineRule="auto"/>
+            </w:pPr>
             <w:r>
-              <w:t>Pi walkthrough, evidence uploads, answers, and PDF evidence</w:t>
+              <w:rPr>
+                <w:rFonts w:ascii="Aptos" w:hAnsi="Aptos"/>
+                <w:sz w:val="17"/>
+              </w:rPr>
+              <w:t>Pi workflow, static/video/live validation, evidence uploads, answers, and PDF evidence</w:t>
             </w:r>
           </w:p>
         </w:tc>
       </w:tr>
       <w:tr>
+        <w:trPr>
+          <w:trHeight w:hRule="atLeast"/>
+        </w:trPr>
         <w:tc>
           <w:tcPr>
-            <w:tcW w:type="dxa" w:w="3600"/>
+            <w:tcW w:type="dxa" w:w="2743200"/>
             <w:vAlign w:val="center"/>
+            <w:tcMar>
+              <w:top w:w="45" w:type="dxa"/>
+              <w:start w:w="65" w:type="dxa"/>
+              <w:bottom w:w="45" w:type="dxa"/>
+              <w:end w:w="65" w:type="dxa"/>
+            </w:tcMar>
           </w:tcPr>
           <w:p>
+            <w:pPr>
+              <w:spacing w:after="0" w:before="0" w:line="228" w:lineRule="auto"/>
+            </w:pPr>
             <w:r>
+              <w:rPr>
+                <w:rFonts w:ascii="Aptos" w:hAnsi="Aptos"/>
+                <w:sz w:val="17"/>
+              </w:rPr>
               <w:t>YOLO box-label dataset</w:t>
             </w:r>
           </w:p>
         </w:tc>
         <w:tc>
           <w:tcPr>
-            <w:tcW w:type="dxa" w:w="7200"/>
+            <w:tcW w:type="dxa" w:w="4572000"/>
             <w:vAlign w:val="center"/>
+            <w:tcMar>
+              <w:top w:w="45" w:type="dxa"/>
+              <w:start w:w="65" w:type="dxa"/>
+              <w:bottom w:w="45" w:type="dxa"/>
+              <w:end w:w="65" w:type="dxa"/>
+            </w:tcMar>
           </w:tcPr>
           <w:p>
+            <w:pPr>
+              <w:spacing w:after="0" w:before="0" w:line="228" w:lineRule="auto"/>
+            </w:pPr>
             <w:r>
-              <w:t>Shared training data</w:t>
+              <w:rPr>
+                <w:rFonts w:ascii="Aptos" w:hAnsi="Aptos"/>
+                <w:sz w:val="17"/>
+              </w:rPr>
+              <w:t>Shared model-training data</w:t>
             </w:r>
           </w:p>
         </w:tc>
       </w:tr>
       <w:tr>
+        <w:trPr>
+          <w:trHeight w:hRule="atLeast"/>
+        </w:trPr>
         <w:tc>
           <w:tcPr>
-            <w:tcW w:type="dxa" w:w="3600"/>
+            <w:tcW w:type="dxa" w:w="2743200"/>
             <w:vAlign w:val="center"/>
+            <w:tcMar>
+              <w:top w:w="45" w:type="dxa"/>
+              <w:start w:w="65" w:type="dxa"/>
+              <w:bottom w:w="45" w:type="dxa"/>
+              <w:end w:w="65" w:type="dxa"/>
+            </w:tcMar>
           </w:tcPr>
           <w:p>
+            <w:pPr>
+              <w:spacing w:after="0" w:before="0" w:line="228" w:lineRule="auto"/>
+            </w:pPr>
             <w:r>
-              <w:t>Validation images and video</w:t>
+              <w:rPr>
+                <w:rFonts w:ascii="Aptos" w:hAnsi="Aptos"/>
+                <w:sz w:val="17"/>
+              </w:rPr>
+              <w:t>Validation images and videos</w:t>
             </w:r>
           </w:p>
         </w:tc>
         <w:tc>
           <w:tcPr>
-            <w:tcW w:type="dxa" w:w="7200"/>
+            <w:tcW w:type="dxa" w:w="4572000"/>
             <w:vAlign w:val="center"/>
+            <w:tcMar>
+              <w:top w:w="45" w:type="dxa"/>
+              <w:start w:w="65" w:type="dxa"/>
+              <w:bottom w:w="45" w:type="dxa"/>
+              <w:end w:w="65" w:type="dxa"/>
+            </w:tcMar>
           </w:tcPr>
           <w:p>
+            <w:pPr>
+              <w:spacing w:after="0" w:before="0" w:line="228" w:lineRule="auto"/>
+            </w:pPr>
             <w:r>
-              <w:t>Generalization and video testing</w:t>
+              <w:rPr>
+                <w:rFonts w:ascii="Aptos" w:hAnsi="Aptos"/>
+                <w:sz w:val="17"/>
+              </w:rPr>
+              <w:t>Controlled generalization and temporal validation</w:t>
             </w:r>
           </w:p>
         </w:tc>
       </w:tr>
       <w:tr>
+        <w:trPr>
+          <w:trHeight w:hRule="atLeast"/>
+        </w:trPr>
         <w:tc>
           <w:tcPr>
-            <w:tcW w:type="dxa" w:w="3600"/>
+            <w:tcW w:type="dxa" w:w="2743200"/>
             <w:vAlign w:val="center"/>
+            <w:tcMar>
+              <w:top w:w="45" w:type="dxa"/>
+              <w:start w:w="65" w:type="dxa"/>
+              <w:bottom w:w="45" w:type="dxa"/>
+              <w:end w:w="65" w:type="dxa"/>
+            </w:tcMar>
           </w:tcPr>
           <w:p>
+            <w:pPr>
+              <w:spacing w:after="0" w:before="0" w:line="228" w:lineRule="auto"/>
+            </w:pPr>
             <w:r>
-              <w:t>USB-webcam Pi script</w:t>
+              <w:rPr>
+                <w:rFonts w:ascii="Aptos" w:hAnsi="Aptos"/>
+                <w:sz w:val="17"/>
+              </w:rPr>
+              <w:t>shared/models/yolo26n.pt</w:t>
             </w:r>
           </w:p>
         </w:tc>
         <w:tc>
           <w:tcPr>
-            <w:tcW w:type="dxa" w:w="7200"/>
+            <w:tcW w:type="dxa" w:w="4572000"/>
             <w:vAlign w:val="center"/>
+            <w:tcMar>
+              <w:top w:w="45" w:type="dxa"/>
+              <w:start w:w="65" w:type="dxa"/>
+              <w:bottom w:w="45" w:type="dxa"/>
+              <w:end w:w="65" w:type="dxa"/>
+            </w:tcMar>
           </w:tcPr>
           <w:p>
+            <w:pPr>
+              <w:spacing w:after="0" w:before="0" w:line="228" w:lineRule="auto"/>
+            </w:pPr>
             <w:r>
-              <w:t>Static and live inference on Raspberry Pi 5</w:t>
+              <w:rPr>
+                <w:rFonts w:ascii="Aptos" w:hAnsi="Aptos"/>
+                <w:sz w:val="17"/>
+              </w:rPr>
+              <w:t>Instructor-supplied pretrained baseline model</w:t>
             </w:r>
           </w:p>
         </w:tc>
       </w:tr>
       <w:tr>
+        <w:trPr>
+          <w:trHeight w:hRule="atLeast"/>
+        </w:trPr>
         <w:tc>
           <w:tcPr>
-            <w:tcW w:type="dxa" w:w="3600"/>
+            <w:tcW w:type="dxa" w:w="2743200"/>
             <w:vAlign w:val="center"/>
+            <w:tcMar>
+              <w:top w:w="45" w:type="dxa"/>
+              <w:start w:w="65" w:type="dxa"/>
+              <w:bottom w:w="45" w:type="dxa"/>
+              <w:end w:w="65" w:type="dxa"/>
+            </w:tcMar>
           </w:tcPr>
           <w:p>
+            <w:pPr>
+              <w:spacing w:after="0" w:before="0" w:line="228" w:lineRule="auto"/>
+            </w:pPr>
             <w:r>
-              <w:t>Environment checker</w:t>
+              <w:rPr>
+                <w:rFonts w:ascii="Aptos" w:hAnsi="Aptos"/>
+                <w:sz w:val="17"/>
+              </w:rPr>
+              <w:t>shared/pi5/megalopa_detection_usb.py</w:t>
             </w:r>
           </w:p>
         </w:tc>
         <w:tc>
           <w:tcPr>
-            <w:tcW w:type="dxa" w:w="7200"/>
+            <w:tcW w:type="dxa" w:w="4572000"/>
             <w:vAlign w:val="center"/>
+            <w:tcMar>
+              <w:top w:w="45" w:type="dxa"/>
+              <w:start w:w="65" w:type="dxa"/>
+              <w:bottom w:w="45" w:type="dxa"/>
+              <w:end w:w="65" w:type="dxa"/>
+            </w:tcMar>
           </w:tcPr>
           <w:p>
+            <w:pPr>
+              <w:spacing w:after="0" w:before="0" w:line="228" w:lineRule="auto"/>
+            </w:pPr>
             <w:r>
-              <w:t>Verify OpenCV, Ultralytics, display, and webcam</w:t>
+              <w:rPr>
+                <w:rFonts w:ascii="Aptos" w:hAnsi="Aptos"/>
+                <w:sz w:val="17"/>
+              </w:rPr>
+              <w:t>Image, recorded-video, and USB-webcam inference on Raspberry Pi 5</w:t>
+            </w:r>
+          </w:p>
+        </w:tc>
+      </w:tr>
+      <w:tr>
+        <w:trPr>
+          <w:trHeight w:hRule="atLeast"/>
+        </w:trPr>
+        <w:tc>
+          <w:tcPr>
+            <w:tcW w:type="dxa" w:w="2743200"/>
+            <w:vAlign w:val="center"/>
+            <w:tcMar>
+              <w:top w:w="45" w:type="dxa"/>
+              <w:start w:w="65" w:type="dxa"/>
+              <w:bottom w:w="45" w:type="dxa"/>
+              <w:end w:w="65" w:type="dxa"/>
+            </w:tcMar>
+          </w:tcPr>
+          <w:p>
+            <w:pPr>
+              <w:spacing w:after="0" w:before="0" w:line="228" w:lineRule="auto"/>
+            </w:pPr>
+            <w:r>
+              <w:rPr>
+                <w:rFonts w:ascii="Aptos" w:hAnsi="Aptos"/>
+                <w:sz w:val="17"/>
+              </w:rPr>
+              <w:t>requirements-pi files</w:t>
+            </w:r>
+          </w:p>
+        </w:tc>
+        <w:tc>
+          <w:tcPr>
+            <w:tcW w:type="dxa" w:w="4572000"/>
+            <w:vAlign w:val="center"/>
+            <w:tcMar>
+              <w:top w:w="45" w:type="dxa"/>
+              <w:start w:w="65" w:type="dxa"/>
+              <w:bottom w:w="45" w:type="dxa"/>
+              <w:end w:w="65" w:type="dxa"/>
+            </w:tcMar>
+          </w:tcPr>
+          <w:p>
+            <w:pPr>
+              <w:spacing w:after="0" w:before="0" w:line="228" w:lineRule="auto"/>
+            </w:pPr>
+            <w:r>
+              <w:rPr>
+                <w:rFonts w:ascii="Aptos" w:hAnsi="Aptos"/>
+                <w:sz w:val="17"/>
+              </w:rPr>
+              <w:t>Staged core and ONNX package guidance</w:t>
+            </w:r>
+          </w:p>
+        </w:tc>
+      </w:tr>
+      <w:tr>
+        <w:trPr>
+          <w:trHeight w:hRule="atLeast"/>
+        </w:trPr>
+        <w:tc>
+          <w:tcPr>
+            <w:tcW w:type="dxa" w:w="2743200"/>
+            <w:vAlign w:val="center"/>
+            <w:tcMar>
+              <w:top w:w="45" w:type="dxa"/>
+              <w:start w:w="65" w:type="dxa"/>
+              <w:bottom w:w="45" w:type="dxa"/>
+              <w:end w:w="65" w:type="dxa"/>
+            </w:tcMar>
+          </w:tcPr>
+          <w:p>
+            <w:pPr>
+              <w:spacing w:after="0" w:before="0" w:line="228" w:lineRule="auto"/>
+            </w:pPr>
+            <w:r>
+              <w:rPr>
+                <w:rFonts w:ascii="Aptos" w:hAnsi="Aptos"/>
+                <w:sz w:val="17"/>
+              </w:rPr>
+              <w:t>Prepared Raspberry Pi 5 kit</w:t>
+            </w:r>
+          </w:p>
+        </w:tc>
+        <w:tc>
+          <w:tcPr>
+            <w:tcW w:type="dxa" w:w="4572000"/>
+            <w:vAlign w:val="center"/>
+            <w:tcMar>
+              <w:top w:w="45" w:type="dxa"/>
+              <w:start w:w="65" w:type="dxa"/>
+              <w:bottom w:w="45" w:type="dxa"/>
+              <w:end w:w="65" w:type="dxa"/>
+            </w:tcMar>
+          </w:tcPr>
+          <w:p>
+            <w:pPr>
+              <w:spacing w:after="0" w:before="0" w:line="228" w:lineRule="auto"/>
+            </w:pPr>
+            <w:r>
+              <w:rPr>
+                <w:rFonts w:ascii="Aptos" w:hAnsi="Aptos"/>
+                <w:sz w:val="17"/>
+              </w:rPr>
+              <w:t>Local screen, keyboard, mouse, internet, Git, Python venv support, and USB webcam</w:t>
             </w:r>
           </w:p>
         </w:tc>
       </w:tr>
     </w:tbl>
-    <w:p/>
     <w:p>
       <w:pPr>
         <w:pStyle w:val="Heading1"/>
+        <w:keepNext/>
       </w:pPr>
       <w:r>
         <w:t>4. Session 1 - Dataset, training, evaluation, and fork push</w:t>
@@ -695,27 +1323,39 @@
       <w:tblPr>
         <w:tblStyle w:val="TableGrid"/>
         <w:tblW w:type="auto" w:w="0"/>
-        <w:jc w:val="center"/>
+        <w:tblLayout w:type="fixed"/>
         <w:tblLook w:firstColumn="1" w:firstRow="1" w:lastColumn="0" w:lastRow="0" w:noHBand="0" w:noVBand="1" w:val="04A0"/>
       </w:tblPr>
       <w:tblGrid>
-        <w:gridCol w:w="5040"/>
-        <w:gridCol w:w="5040"/>
+        <w:gridCol w:w="5184"/>
+        <w:gridCol w:w="5184"/>
       </w:tblGrid>
       <w:tr>
         <w:trPr>
+          <w:trHeight w:hRule="atLeast"/>
           <w:tblHeader w:val="true"/>
         </w:trPr>
         <w:tc>
           <w:tcPr>
-            <w:tcW w:type="dxa" w:w="1872"/>
+            <w:tcW w:type="dxa" w:w="1417320"/>
+            <w:vAlign w:val="center"/>
+            <w:tcMar>
+              <w:top w:w="45" w:type="dxa"/>
+              <w:start w:w="65" w:type="dxa"/>
+              <w:bottom w:w="45" w:type="dxa"/>
+              <w:end w:w="65" w:type="dxa"/>
+            </w:tcMar>
             <w:shd w:fill="D9EAF7"/>
-            <w:vAlign w:val="center"/>
           </w:tcPr>
           <w:p>
+            <w:pPr>
+              <w:spacing w:after="0" w:before="0" w:line="228" w:lineRule="auto"/>
+            </w:pPr>
             <w:r>
               <w:rPr>
+                <w:rFonts w:ascii="Aptos" w:hAnsi="Aptos"/>
                 <w:b/>
+                <w:sz w:val="17"/>
               </w:rPr>
               <w:t>Time</w:t>
             </w:r>
@@ -723,14 +1363,25 @@
         </w:tc>
         <w:tc>
           <w:tcPr>
-            <w:tcW w:type="dxa" w:w="8928"/>
+            <w:tcW w:type="dxa" w:w="5897880"/>
+            <w:vAlign w:val="center"/>
+            <w:tcMar>
+              <w:top w:w="45" w:type="dxa"/>
+              <w:start w:w="65" w:type="dxa"/>
+              <w:bottom w:w="45" w:type="dxa"/>
+              <w:end w:w="65" w:type="dxa"/>
+            </w:tcMar>
             <w:shd w:fill="D9EAF7"/>
-            <w:vAlign w:val="center"/>
           </w:tcPr>
           <w:p>
+            <w:pPr>
+              <w:spacing w:after="0" w:before="0" w:line="228" w:lineRule="auto"/>
+            </w:pPr>
             <w:r>
               <w:rPr>
+                <w:rFonts w:ascii="Aptos" w:hAnsi="Aptos"/>
                 <w:b/>
+                <w:sz w:val="17"/>
               </w:rPr>
               <w:t>Activity</w:t>
             </w:r>
@@ -738,178 +1389,386 @@
         </w:tc>
       </w:tr>
       <w:tr>
+        <w:trPr>
+          <w:trHeight w:hRule="atLeast"/>
+        </w:trPr>
         <w:tc>
           <w:tcPr>
-            <w:tcW w:type="dxa" w:w="1872"/>
+            <w:tcW w:type="dxa" w:w="1417320"/>
             <w:vAlign w:val="center"/>
+            <w:tcMar>
+              <w:top w:w="45" w:type="dxa"/>
+              <w:start w:w="65" w:type="dxa"/>
+              <w:bottom w:w="45" w:type="dxa"/>
+              <w:end w:w="65" w:type="dxa"/>
+            </w:tcMar>
           </w:tcPr>
           <w:p>
+            <w:pPr>
+              <w:spacing w:after="0" w:before="0" w:line="228" w:lineRule="auto"/>
+            </w:pPr>
             <w:r>
+              <w:rPr>
+                <w:rFonts w:ascii="Aptos" w:hAnsi="Aptos"/>
+                <w:sz w:val="17"/>
+              </w:rPr>
               <w:t>0-15 min</w:t>
             </w:r>
           </w:p>
         </w:tc>
         <w:tc>
           <w:tcPr>
-            <w:tcW w:type="dxa" w:w="8928"/>
+            <w:tcW w:type="dxa" w:w="5897880"/>
             <w:vAlign w:val="center"/>
+            <w:tcMar>
+              <w:top w:w="45" w:type="dxa"/>
+              <w:start w:w="65" w:type="dxa"/>
+              <w:bottom w:w="45" w:type="dxa"/>
+              <w:end w:w="65" w:type="dxa"/>
+            </w:tcMar>
           </w:tcPr>
           <w:p>
+            <w:pPr>
+              <w:spacing w:after="0" w:before="0" w:line="228" w:lineRule="auto"/>
+            </w:pPr>
             <w:r>
+              <w:rPr>
+                <w:rFonts w:ascii="Aptos" w:hAnsi="Aptos"/>
+                <w:sz w:val="17"/>
+              </w:rPr>
               <w:t>Student information, fork verification, and Colab setup</w:t>
             </w:r>
           </w:p>
         </w:tc>
       </w:tr>
       <w:tr>
+        <w:trPr>
+          <w:trHeight w:hRule="atLeast"/>
+        </w:trPr>
         <w:tc>
           <w:tcPr>
-            <w:tcW w:type="dxa" w:w="1872"/>
+            <w:tcW w:type="dxa" w:w="1417320"/>
             <w:vAlign w:val="center"/>
+            <w:tcMar>
+              <w:top w:w="45" w:type="dxa"/>
+              <w:start w:w="65" w:type="dxa"/>
+              <w:bottom w:w="45" w:type="dxa"/>
+              <w:end w:w="65" w:type="dxa"/>
+            </w:tcMar>
           </w:tcPr>
           <w:p>
+            <w:pPr>
+              <w:spacing w:after="0" w:before="0" w:line="228" w:lineRule="auto"/>
+            </w:pPr>
             <w:r>
+              <w:rPr>
+                <w:rFonts w:ascii="Aptos" w:hAnsi="Aptos"/>
+                <w:sz w:val="17"/>
+              </w:rPr>
               <w:t>15-35 min</w:t>
             </w:r>
           </w:p>
         </w:tc>
         <w:tc>
           <w:tcPr>
-            <w:tcW w:type="dxa" w:w="8928"/>
+            <w:tcW w:type="dxa" w:w="5897880"/>
             <w:vAlign w:val="center"/>
+            <w:tcMar>
+              <w:top w:w="45" w:type="dxa"/>
+              <w:start w:w="65" w:type="dxa"/>
+              <w:bottom w:w="45" w:type="dxa"/>
+              <w:end w:w="65" w:type="dxa"/>
+            </w:tcMar>
           </w:tcPr>
           <w:p>
+            <w:pPr>
+              <w:spacing w:after="0" w:before="0" w:line="228" w:lineRule="auto"/>
+            </w:pPr>
             <w:r>
+              <w:rPr>
+                <w:rFonts w:ascii="Aptos" w:hAnsi="Aptos"/>
+                <w:sz w:val="17"/>
+              </w:rPr>
               <w:t>Dataset inspection and random five-image preview</w:t>
             </w:r>
           </w:p>
         </w:tc>
       </w:tr>
       <w:tr>
+        <w:trPr>
+          <w:trHeight w:hRule="atLeast"/>
+        </w:trPr>
         <w:tc>
           <w:tcPr>
-            <w:tcW w:type="dxa" w:w="1872"/>
+            <w:tcW w:type="dxa" w:w="1417320"/>
             <w:vAlign w:val="center"/>
+            <w:tcMar>
+              <w:top w:w="45" w:type="dxa"/>
+              <w:start w:w="65" w:type="dxa"/>
+              <w:bottom w:w="45" w:type="dxa"/>
+              <w:end w:w="65" w:type="dxa"/>
+            </w:tcMar>
           </w:tcPr>
           <w:p>
+            <w:pPr>
+              <w:spacing w:after="0" w:before="0" w:line="228" w:lineRule="auto"/>
+            </w:pPr>
             <w:r>
+              <w:rPr>
+                <w:rFonts w:ascii="Aptos" w:hAnsi="Aptos"/>
+                <w:sz w:val="17"/>
+              </w:rPr>
               <w:t>35-50 min</w:t>
             </w:r>
           </w:p>
         </w:tc>
         <w:tc>
           <w:tcPr>
-            <w:tcW w:type="dxa" w:w="8928"/>
+            <w:tcW w:type="dxa" w:w="5897880"/>
             <w:vAlign w:val="center"/>
+            <w:tcMar>
+              <w:top w:w="45" w:type="dxa"/>
+              <w:start w:w="65" w:type="dxa"/>
+              <w:bottom w:w="45" w:type="dxa"/>
+              <w:end w:w="65" w:type="dxa"/>
+            </w:tcMar>
           </w:tcPr>
           <w:p>
+            <w:pPr>
+              <w:spacing w:after="0" w:before="0" w:line="228" w:lineRule="auto"/>
+            </w:pPr>
             <w:r>
+              <w:rPr>
+                <w:rFonts w:ascii="Aptos" w:hAnsi="Aptos"/>
+                <w:sz w:val="17"/>
+              </w:rPr>
               <w:t>Dataset split and training-parameter explanation</w:t>
             </w:r>
           </w:p>
         </w:tc>
       </w:tr>
       <w:tr>
+        <w:trPr>
+          <w:trHeight w:hRule="atLeast"/>
+        </w:trPr>
         <w:tc>
           <w:tcPr>
-            <w:tcW w:type="dxa" w:w="1872"/>
+            <w:tcW w:type="dxa" w:w="1417320"/>
             <w:vAlign w:val="center"/>
+            <w:tcMar>
+              <w:top w:w="45" w:type="dxa"/>
+              <w:start w:w="65" w:type="dxa"/>
+              <w:bottom w:w="45" w:type="dxa"/>
+              <w:end w:w="65" w:type="dxa"/>
+            </w:tcMar>
           </w:tcPr>
           <w:p>
+            <w:pPr>
+              <w:spacing w:after="0" w:before="0" w:line="228" w:lineRule="auto"/>
+            </w:pPr>
             <w:r>
+              <w:rPr>
+                <w:rFonts w:ascii="Aptos" w:hAnsi="Aptos"/>
+                <w:sz w:val="17"/>
+              </w:rPr>
               <w:t>50-85 min</w:t>
             </w:r>
           </w:p>
         </w:tc>
         <w:tc>
           <w:tcPr>
-            <w:tcW w:type="dxa" w:w="8928"/>
+            <w:tcW w:type="dxa" w:w="5897880"/>
             <w:vAlign w:val="center"/>
+            <w:tcMar>
+              <w:top w:w="45" w:type="dxa"/>
+              <w:start w:w="65" w:type="dxa"/>
+              <w:bottom w:w="45" w:type="dxa"/>
+              <w:end w:w="65" w:type="dxa"/>
+            </w:tcMar>
           </w:tcPr>
           <w:p>
+            <w:pPr>
+              <w:spacing w:after="0" w:before="0" w:line="228" w:lineRule="auto"/>
+            </w:pPr>
             <w:r>
+              <w:rPr>
+                <w:rFonts w:ascii="Aptos" w:hAnsi="Aptos"/>
+                <w:sz w:val="17"/>
+              </w:rPr>
               <w:t>YOLO26n training</w:t>
             </w:r>
           </w:p>
         </w:tc>
       </w:tr>
       <w:tr>
+        <w:trPr>
+          <w:trHeight w:hRule="atLeast"/>
+        </w:trPr>
         <w:tc>
           <w:tcPr>
-            <w:tcW w:type="dxa" w:w="1872"/>
+            <w:tcW w:type="dxa" w:w="1417320"/>
             <w:vAlign w:val="center"/>
+            <w:tcMar>
+              <w:top w:w="45" w:type="dxa"/>
+              <w:start w:w="65" w:type="dxa"/>
+              <w:bottom w:w="45" w:type="dxa"/>
+              <w:end w:w="65" w:type="dxa"/>
+            </w:tcMar>
           </w:tcPr>
           <w:p>
+            <w:pPr>
+              <w:spacing w:after="0" w:before="0" w:line="228" w:lineRule="auto"/>
+            </w:pPr>
             <w:r>
+              <w:rPr>
+                <w:rFonts w:ascii="Aptos" w:hAnsi="Aptos"/>
+                <w:sz w:val="17"/>
+              </w:rPr>
               <w:t>85-105 min</w:t>
             </w:r>
           </w:p>
         </w:tc>
         <w:tc>
           <w:tcPr>
-            <w:tcW w:type="dxa" w:w="8928"/>
+            <w:tcW w:type="dxa" w:w="5897880"/>
             <w:vAlign w:val="center"/>
+            <w:tcMar>
+              <w:top w:w="45" w:type="dxa"/>
+              <w:start w:w="65" w:type="dxa"/>
+              <w:bottom w:w="45" w:type="dxa"/>
+              <w:end w:w="65" w:type="dxa"/>
+            </w:tcMar>
           </w:tcPr>
           <w:p>
+            <w:pPr>
+              <w:spacing w:after="0" w:before="0" w:line="228" w:lineRule="auto"/>
+            </w:pPr>
             <w:r>
+              <w:rPr>
+                <w:rFonts w:ascii="Aptos" w:hAnsi="Aptos"/>
+                <w:sz w:val="17"/>
+              </w:rPr>
               <w:t>Metrics, plots, and model export</w:t>
             </w:r>
           </w:p>
         </w:tc>
       </w:tr>
       <w:tr>
+        <w:trPr>
+          <w:trHeight w:hRule="atLeast"/>
+        </w:trPr>
         <w:tc>
           <w:tcPr>
-            <w:tcW w:type="dxa" w:w="1872"/>
+            <w:tcW w:type="dxa" w:w="1417320"/>
             <w:vAlign w:val="center"/>
+            <w:tcMar>
+              <w:top w:w="45" w:type="dxa"/>
+              <w:start w:w="65" w:type="dxa"/>
+              <w:bottom w:w="45" w:type="dxa"/>
+              <w:end w:w="65" w:type="dxa"/>
+            </w:tcMar>
           </w:tcPr>
           <w:p>
+            <w:pPr>
+              <w:spacing w:after="0" w:before="0" w:line="228" w:lineRule="auto"/>
+            </w:pPr>
             <w:r>
+              <w:rPr>
+                <w:rFonts w:ascii="Aptos" w:hAnsi="Aptos"/>
+                <w:sz w:val="17"/>
+              </w:rPr>
               <w:t>105-115 min</w:t>
             </w:r>
           </w:p>
         </w:tc>
         <w:tc>
           <w:tcPr>
-            <w:tcW w:type="dxa" w:w="8928"/>
+            <w:tcW w:type="dxa" w:w="5897880"/>
             <w:vAlign w:val="center"/>
+            <w:tcMar>
+              <w:top w:w="45" w:type="dxa"/>
+              <w:start w:w="65" w:type="dxa"/>
+              <w:bottom w:w="45" w:type="dxa"/>
+              <w:end w:w="65" w:type="dxa"/>
+            </w:tcMar>
           </w:tcPr>
           <w:p>
+            <w:pPr>
+              <w:spacing w:after="0" w:before="0" w:line="228" w:lineRule="auto"/>
+            </w:pPr>
             <w:r>
+              <w:rPr>
+                <w:rFonts w:ascii="Aptos" w:hAnsi="Aptos"/>
+                <w:sz w:val="17"/>
+              </w:rPr>
               <w:t>Image and video validation</w:t>
             </w:r>
           </w:p>
         </w:tc>
       </w:tr>
       <w:tr>
+        <w:trPr>
+          <w:trHeight w:hRule="atLeast"/>
+        </w:trPr>
         <w:tc>
           <w:tcPr>
-            <w:tcW w:type="dxa" w:w="1872"/>
+            <w:tcW w:type="dxa" w:w="1417320"/>
             <w:vAlign w:val="center"/>
+            <w:tcMar>
+              <w:top w:w="45" w:type="dxa"/>
+              <w:start w:w="65" w:type="dxa"/>
+              <w:bottom w:w="45" w:type="dxa"/>
+              <w:end w:w="65" w:type="dxa"/>
+            </w:tcMar>
           </w:tcPr>
           <w:p>
+            <w:pPr>
+              <w:spacing w:after="0" w:before="0" w:line="228" w:lineRule="auto"/>
+            </w:pPr>
             <w:r>
+              <w:rPr>
+                <w:rFonts w:ascii="Aptos" w:hAnsi="Aptos"/>
+                <w:sz w:val="17"/>
+              </w:rPr>
               <w:t>115-120 min</w:t>
             </w:r>
           </w:p>
         </w:tc>
         <w:tc>
           <w:tcPr>
-            <w:tcW w:type="dxa" w:w="8928"/>
+            <w:tcW w:type="dxa" w:w="5897880"/>
             <w:vAlign w:val="center"/>
+            <w:tcMar>
+              <w:top w:w="45" w:type="dxa"/>
+              <w:start w:w="65" w:type="dxa"/>
+              <w:bottom w:w="45" w:type="dxa"/>
+              <w:end w:w="65" w:type="dxa"/>
+            </w:tcMar>
           </w:tcPr>
           <w:p>
+            <w:pPr>
+              <w:spacing w:after="0" w:before="0" w:line="228" w:lineRule="auto"/>
+            </w:pPr>
             <w:r>
+              <w:rPr>
+                <w:rFonts w:ascii="Aptos" w:hAnsi="Aptos"/>
+                <w:sz w:val="17"/>
+              </w:rPr>
               <w:t>Commit and push student_work/ to the group fork</w:t>
             </w:r>
           </w:p>
         </w:tc>
       </w:tr>
     </w:tbl>
-    <w:p/>
+    <w:p>
+      <w:r>
+        <w:br w:type="page"/>
+      </w:r>
+    </w:p>
     <w:p>
       <w:pPr>
         <w:pStyle w:val="Heading2"/>
+        <w:keepNext/>
       </w:pPr>
       <w:r>
         <w:t>4.1 Required Session 1 workflow</w:t>
@@ -917,96 +1776,192 @@
     </w:p>
     <w:p>
       <w:pPr>
-        <w:pStyle w:val="ListNumber"/>
+        <w:keepLines/>
+        <w:spacing w:after="20"/>
+        <w:ind w:left="346" w:hanging="346"/>
       </w:pPr>
+      <w:r>
+        <w:rPr>
+          <w:b/>
+        </w:rPr>
+        <w:t xml:space="preserve">1. </w:t>
+      </w:r>
       <w:r>
         <w:t>Enter group members, section, group number, fork owner, fork repository name, GitHub username, and commit email.</w:t>
       </w:r>
     </w:p>
     <w:p>
       <w:pPr>
-        <w:pStyle w:val="ListNumber"/>
+        <w:keepLines/>
+        <w:spacing w:after="20"/>
+        <w:ind w:left="346" w:hanging="346"/>
       </w:pPr>
       <w:r>
-        <w:t>Install only the required Colab packages and verify the GPU.</w:t>
+        <w:rPr>
+          <w:b/>
+        </w:rPr>
+        <w:t xml:space="preserve">2. </w:t>
+      </w:r>
+      <w:r>
+        <w:t>Install only the required Colab packages and verify the GPU runtime.</w:t>
       </w:r>
     </w:p>
     <w:p>
       <w:pPr>
-        <w:pStyle w:val="ListNumber"/>
+        <w:keepLines/>
+        <w:spacing w:after="20"/>
+        <w:ind w:left="346" w:hanging="346"/>
       </w:pPr>
+      <w:r>
+        <w:rPr>
+          <w:b/>
+        </w:rPr>
+        <w:t xml:space="preserve">3. </w:t>
+      </w:r>
       <w:r>
         <w:t>Clone the public group fork without authentication.</w:t>
       </w:r>
     </w:p>
     <w:p>
       <w:pPr>
-        <w:pStyle w:val="ListNumber"/>
+        <w:keepLines/>
+        <w:spacing w:after="20"/>
+        <w:ind w:left="346" w:hanging="346"/>
       </w:pPr>
       <w:r>
-        <w:t>Inspect dataset counts, image sizes, label pairing, coordinate ranges, and class IDs.</w:t>
+        <w:rPr>
+          <w:b/>
+        </w:rPr>
+        <w:t xml:space="preserve">4. </w:t>
+      </w:r>
+      <w:r>
+        <w:t>Inspect image counts, image sizes, image-label pairing, coordinate ranges, and class IDs.</w:t>
       </w:r>
     </w:p>
     <w:p>
       <w:pPr>
-        <w:pStyle w:val="ListNumber"/>
+        <w:keepLines/>
+        <w:spacing w:after="20"/>
+        <w:ind w:left="346" w:hanging="346"/>
       </w:pPr>
       <w:r>
-        <w:t>Preview five random original/annotated image pairs; rerunning the cell displays another sample.</w:t>
+        <w:rPr>
+          <w:b/>
+        </w:rPr>
+        <w:t xml:space="preserve">5. </w:t>
+      </w:r>
+      <w:r>
+        <w:t>Preview five random original/annotated image pairs; rerunning the cell must produce another sample.</w:t>
       </w:r>
     </w:p>
     <w:p>
       <w:pPr>
-        <w:pStyle w:val="ListNumber"/>
+        <w:keepLines/>
+        <w:spacing w:after="20"/>
+        <w:ind w:left="346" w:hanging="346"/>
       </w:pPr>
       <w:r>
-        <w:t>Create a 70/20/10 split in temporary Colab storage.</w:t>
+        <w:rPr>
+          <w:b/>
+        </w:rPr>
+        <w:t xml:space="preserve">6. </w:t>
+      </w:r>
+      <w:r>
+        <w:t>Create the required train/validation/test split in temporary Colab storage.</w:t>
       </w:r>
     </w:p>
     <w:p>
       <w:pPr>
-        <w:pStyle w:val="ListNumber"/>
+        <w:keepLines/>
+        <w:spacing w:after="20"/>
+        <w:ind w:left="346" w:hanging="346"/>
       </w:pPr>
+      <w:r>
+        <w:rPr>
+          <w:b/>
+        </w:rPr>
+        <w:t xml:space="preserve">7. </w:t>
+      </w:r>
       <w:r>
         <w:t>Train YOLO26n using the instructor-defined parameters.</w:t>
       </w:r>
     </w:p>
     <w:p>
       <w:pPr>
-        <w:pStyle w:val="ListNumber"/>
+        <w:keepLines/>
+        <w:spacing w:after="20"/>
+        <w:ind w:left="346" w:hanging="346"/>
       </w:pPr>
+      <w:r>
+        <w:rPr>
+          <w:b/>
+        </w:rPr>
+        <w:t xml:space="preserve">8. </w:t>
+      </w:r>
       <w:r>
         <w:t>Display numerical metrics and all available YOLO plots.</w:t>
       </w:r>
     </w:p>
     <w:p>
       <w:pPr>
-        <w:pStyle w:val="ListNumber"/>
+        <w:keepLines/>
+        <w:spacing w:after="20"/>
+        <w:ind w:left="346" w:hanging="346"/>
       </w:pPr>
+      <w:r>
+        <w:rPr>
+          <w:b/>
+        </w:rPr>
+        <w:t xml:space="preserve">9. </w:t>
+      </w:r>
       <w:r>
         <w:t>Save best.pt, export ONNX, and verify both formats on the same image.</w:t>
       </w:r>
     </w:p>
     <w:p>
       <w:pPr>
-        <w:pStyle w:val="ListNumber"/>
+        <w:keepLines/>
+        <w:spacing w:after="20"/>
+        <w:ind w:left="346" w:hanging="346"/>
       </w:pPr>
       <w:r>
-        <w:t>Validate on five test images, supplied validation images, and the supplied video.</w:t>
+        <w:rPr>
+          <w:b/>
+        </w:rPr>
+        <w:t xml:space="preserve">10. </w:t>
+      </w:r>
+      <w:r>
+        <w:t>Validate the model on test images, supplied validation images, and the supplied validation video.</w:t>
       </w:r>
     </w:p>
     <w:p>
       <w:pPr>
-        <w:pStyle w:val="ListNumber"/>
+        <w:keepLines/>
+        <w:spacing w:after="20"/>
+        <w:ind w:left="346" w:hanging="346"/>
       </w:pPr>
       <w:r>
-        <w:t>Stage only student_work/, authenticate using Colab Secrets, and push to the group fork.</w:t>
+        <w:rPr>
+          <w:b/>
+        </w:rPr>
+        <w:t xml:space="preserve">11. </w:t>
+      </w:r>
+      <w:r>
+        <w:t>Stage only student_work/, authenticate through Colab Secrets, and push to the group fork.</w:t>
       </w:r>
     </w:p>
     <w:p>
       <w:pPr>
-        <w:pStyle w:val="ListNumber"/>
+        <w:keepLines/>
+        <w:spacing w:after="20"/>
+        <w:ind w:left="346" w:hanging="346"/>
       </w:pPr>
+      <w:r>
+        <w:rPr>
+          <w:b/>
+        </w:rPr>
+        <w:t xml:space="preserve">12. </w:t>
+      </w:r>
       <w:r>
         <w:t>Print the completed notebook as SecXX_GroupXX_Lab4_Session1.pdf.</w:t>
       </w:r>
@@ -1014,6 +1969,7 @@
     <w:p>
       <w:pPr>
         <w:pStyle w:val="Heading2"/>
+        <w:keepNext/>
       </w:pPr>
       <w:r>
         <w:t>4.2 GitHub authentication for the final push</w:t>
@@ -1026,7 +1982,9 @@
     </w:p>
     <w:p>
       <w:pPr>
-        <w:pStyle w:val="ListNumber"/>
+        <w:pStyle w:val="ListBullet"/>
+        <w:keepLines/>
+        <w:spacing w:after="20"/>
       </w:pPr>
       <w:r>
         <w:t>Create a fine-grained personal access token.</w:t>
@@ -1034,7 +1992,9 @@
     </w:p>
     <w:p>
       <w:pPr>
-        <w:pStyle w:val="ListNumber"/>
+        <w:pStyle w:val="ListBullet"/>
+        <w:keepLines/>
+        <w:spacing w:after="20"/>
       </w:pPr>
       <w:r>
         <w:t>Limit repository access to the group fork.</w:t>
@@ -1042,7 +2002,9 @@
     </w:p>
     <w:p>
       <w:pPr>
-        <w:pStyle w:val="ListNumber"/>
+        <w:pStyle w:val="ListBullet"/>
+        <w:keepLines/>
+        <w:spacing w:after="20"/>
       </w:pPr>
       <w:r>
         <w:t>Set Contents permission to Read and write.</w:t>
@@ -1050,7 +2012,9 @@
     </w:p>
     <w:p>
       <w:pPr>
-        <w:pStyle w:val="ListNumber"/>
+        <w:pStyle w:val="ListBullet"/>
+        <w:keepLines/>
+        <w:spacing w:after="20"/>
       </w:pPr>
       <w:r>
         <w:t>Store the token in Colab Secrets as GITHUB_TOKEN.</w:t>
@@ -1058,15 +2022,18 @@
     </w:p>
     <w:p>
       <w:pPr>
-        <w:pStyle w:val="ListNumber"/>
+        <w:pStyle w:val="ListBullet"/>
+        <w:keepLines/>
+        <w:spacing w:after="20"/>
       </w:pPr>
       <w:r>
-        <w:t>Never paste the token into a visible notebook cell or PDF.</w:t>
+        <w:t>Never paste the token into a visible notebook cell, output, screenshot, or PDF.</w:t>
       </w:r>
     </w:p>
     <w:p>
       <w:pPr>
         <w:pStyle w:val="Heading1"/>
+        <w:keepNext/>
       </w:pPr>
       <w:r>
         <w:t>5. Session 2 - Raspberry Pi 5 deployment</w:t>
@@ -1074,34 +2041,62 @@
     </w:p>
     <w:p>
       <w:r>
-        <w:t>The development kit already contains Raspberry Pi OS, a local screen, Python, Git, OpenCV, and Ultralytics. The camera is a USB webcam. Students do not prepare an SD card and do not use SSH.</w:t>
+        <w:t>The prepared kit contains Raspberry Pi OS, a local display, keyboard, mouse, internet access, Git, Python 3 with venv support, and a USB webcam. Students do not prepare an SD card and do not use SSH.</w:t>
+      </w:r>
+    </w:p>
+    <w:p>
+      <w:pPr>
+        <w:keepLines/>
+        <w:spacing w:before="60" w:after="80"/>
+      </w:pPr>
+      <w:r>
+        <w:rPr>
+          <w:b/>
+          <w:color w:val="C0504D"/>
+        </w:rPr>
+        <w:t xml:space="preserve">System package rule: </w:t>
+      </w:r>
+      <w:r>
+        <w:t>Students must not run sudo apt update, sudo apt upgrade, or sudo apt install during the session. Those commands may trigger unrelated kernel/DKMS failures on a prepared Pi. System packages must be repaired and prepared by the instructor before class.</w:t>
       </w:r>
     </w:p>
     <w:tbl>
       <w:tblPr>
         <w:tblStyle w:val="TableGrid"/>
         <w:tblW w:type="auto" w:w="0"/>
-        <w:jc w:val="center"/>
+        <w:tblLayout w:type="fixed"/>
         <w:tblLook w:firstColumn="1" w:firstRow="1" w:lastColumn="0" w:lastRow="0" w:noHBand="0" w:noVBand="1" w:val="04A0"/>
       </w:tblPr>
       <w:tblGrid>
-        <w:gridCol w:w="5040"/>
-        <w:gridCol w:w="5040"/>
+        <w:gridCol w:w="5184"/>
+        <w:gridCol w:w="5184"/>
       </w:tblGrid>
       <w:tr>
         <w:trPr>
+          <w:trHeight w:hRule="atLeast"/>
           <w:tblHeader w:val="true"/>
         </w:trPr>
         <w:tc>
           <w:tcPr>
-            <w:tcW w:type="dxa" w:w="1872"/>
+            <w:tcW w:type="dxa" w:w="1417320"/>
+            <w:vAlign w:val="center"/>
+            <w:tcMar>
+              <w:top w:w="45" w:type="dxa"/>
+              <w:start w:w="65" w:type="dxa"/>
+              <w:bottom w:w="45" w:type="dxa"/>
+              <w:end w:w="65" w:type="dxa"/>
+            </w:tcMar>
             <w:shd w:fill="D9EAF7"/>
-            <w:vAlign w:val="center"/>
           </w:tcPr>
           <w:p>
+            <w:pPr>
+              <w:spacing w:after="0" w:before="0" w:line="228" w:lineRule="auto"/>
+            </w:pPr>
             <w:r>
               <w:rPr>
+                <w:rFonts w:ascii="Aptos" w:hAnsi="Aptos"/>
                 <w:b/>
+                <w:sz w:val="17"/>
               </w:rPr>
               <w:t>Time</w:t>
             </w:r>
@@ -1109,14 +2104,25 @@
         </w:tc>
         <w:tc>
           <w:tcPr>
-            <w:tcW w:type="dxa" w:w="8928"/>
+            <w:tcW w:type="dxa" w:w="5897880"/>
+            <w:vAlign w:val="center"/>
+            <w:tcMar>
+              <w:top w:w="45" w:type="dxa"/>
+              <w:start w:w="65" w:type="dxa"/>
+              <w:bottom w:w="45" w:type="dxa"/>
+              <w:end w:w="65" w:type="dxa"/>
+            </w:tcMar>
             <w:shd w:fill="D9EAF7"/>
-            <w:vAlign w:val="center"/>
           </w:tcPr>
           <w:p>
+            <w:pPr>
+              <w:spacing w:after="0" w:before="0" w:line="228" w:lineRule="auto"/>
+            </w:pPr>
             <w:r>
               <w:rPr>
+                <w:rFonts w:ascii="Aptos" w:hAnsi="Aptos"/>
                 <w:b/>
+                <w:sz w:val="17"/>
               </w:rPr>
               <w:t>Activity</w:t>
             </w:r>
@@ -1124,154 +2130,492 @@
         </w:tc>
       </w:tr>
       <w:tr>
+        <w:trPr>
+          <w:trHeight w:hRule="atLeast"/>
+        </w:trPr>
         <w:tc>
           <w:tcPr>
-            <w:tcW w:type="dxa" w:w="1872"/>
+            <w:tcW w:type="dxa" w:w="1417320"/>
             <w:vAlign w:val="center"/>
+            <w:tcMar>
+              <w:top w:w="45" w:type="dxa"/>
+              <w:start w:w="65" w:type="dxa"/>
+              <w:bottom w:w="45" w:type="dxa"/>
+              <w:end w:w="65" w:type="dxa"/>
+            </w:tcMar>
           </w:tcPr>
           <w:p>
+            <w:pPr>
+              <w:spacing w:after="0" w:before="0" w:line="228" w:lineRule="auto"/>
+            </w:pPr>
             <w:r>
-              <w:t>0-15 min</w:t>
+              <w:rPr>
+                <w:rFonts w:ascii="Aptos" w:hAnsi="Aptos"/>
+                <w:sz w:val="17"/>
+              </w:rPr>
+              <w:t>0-10 min</w:t>
             </w:r>
           </w:p>
         </w:tc>
         <w:tc>
           <w:tcPr>
-            <w:tcW w:type="dxa" w:w="8928"/>
+            <w:tcW w:type="dxa" w:w="5897880"/>
             <w:vAlign w:val="center"/>
+            <w:tcMar>
+              <w:top w:w="45" w:type="dxa"/>
+              <w:start w:w="65" w:type="dxa"/>
+              <w:bottom w:w="45" w:type="dxa"/>
+              <w:end w:w="65" w:type="dxa"/>
+            </w:tcMar>
           </w:tcPr>
           <w:p>
+            <w:pPr>
+              <w:spacing w:after="0" w:before="0" w:line="228" w:lineRule="auto"/>
+            </w:pPr>
             <w:r>
-              <w:t>Verify Pi 5 system and USB webcam</w:t>
+              <w:rPr>
+                <w:rFonts w:ascii="Aptos" w:hAnsi="Aptos"/>
+                <w:sz w:val="17"/>
+              </w:rPr>
+              <w:t>Synchronize the group fork, clone it on the Pi, and verify supplied files</w:t>
             </w:r>
           </w:p>
         </w:tc>
       </w:tr>
       <w:tr>
+        <w:trPr>
+          <w:trHeight w:hRule="atLeast"/>
+        </w:trPr>
         <w:tc>
           <w:tcPr>
-            <w:tcW w:type="dxa" w:w="1872"/>
+            <w:tcW w:type="dxa" w:w="1417320"/>
             <w:vAlign w:val="center"/>
+            <w:tcMar>
+              <w:top w:w="45" w:type="dxa"/>
+              <w:start w:w="65" w:type="dxa"/>
+              <w:bottom w:w="45" w:type="dxa"/>
+              <w:end w:w="65" w:type="dxa"/>
+            </w:tcMar>
           </w:tcPr>
           <w:p>
+            <w:pPr>
+              <w:spacing w:after="0" w:before="0" w:line="228" w:lineRule="auto"/>
+            </w:pPr>
             <w:r>
-              <w:t>15-30 min</w:t>
+              <w:rPr>
+                <w:rFonts w:ascii="Aptos" w:hAnsi="Aptos"/>
+                <w:sz w:val="17"/>
+              </w:rPr>
+              <w:t>10-30 min</w:t>
             </w:r>
           </w:p>
         </w:tc>
         <w:tc>
           <w:tcPr>
-            <w:tcW w:type="dxa" w:w="8928"/>
+            <w:tcW w:type="dxa" w:w="5897880"/>
             <w:vAlign w:val="center"/>
+            <w:tcMar>
+              <w:top w:w="45" w:type="dxa"/>
+              <w:start w:w="65" w:type="dxa"/>
+              <w:bottom w:w="45" w:type="dxa"/>
+              <w:end w:w="65" w:type="dxa"/>
+            </w:tcMar>
           </w:tcPr>
           <w:p>
+            <w:pPr>
+              <w:spacing w:after="0" w:before="0" w:line="228" w:lineRule="auto"/>
+            </w:pPr>
             <w:r>
-              <w:t>Clone the group fork and verify the Session 1 commit/model</w:t>
+              <w:rPr>
+                <w:rFonts w:ascii="Aptos" w:hAnsi="Aptos"/>
+                <w:sz w:val="17"/>
+              </w:rPr>
+              <w:t>Create .venv; install CPU-only PyTorch/Torchvision and Ultralytics; verify environment</w:t>
             </w:r>
           </w:p>
         </w:tc>
       </w:tr>
       <w:tr>
+        <w:trPr>
+          <w:trHeight w:hRule="atLeast"/>
+        </w:trPr>
         <w:tc>
           <w:tcPr>
-            <w:tcW w:type="dxa" w:w="1872"/>
+            <w:tcW w:type="dxa" w:w="1417320"/>
             <w:vAlign w:val="center"/>
+            <w:tcMar>
+              <w:top w:w="45" w:type="dxa"/>
+              <w:start w:w="65" w:type="dxa"/>
+              <w:bottom w:w="45" w:type="dxa"/>
+              <w:end w:w="65" w:type="dxa"/>
+            </w:tcMar>
           </w:tcPr>
           <w:p>
+            <w:pPr>
+              <w:spacing w:after="0" w:before="0" w:line="228" w:lineRule="auto"/>
+            </w:pPr>
             <w:r>
-              <w:t>30-50 min</w:t>
+              <w:rPr>
+                <w:rFonts w:ascii="Aptos" w:hAnsi="Aptos"/>
+                <w:sz w:val="17"/>
+              </w:rPr>
+              <w:t>30-45 min</w:t>
             </w:r>
           </w:p>
         </w:tc>
         <w:tc>
           <w:tcPr>
-            <w:tcW w:type="dxa" w:w="8928"/>
+            <w:tcW w:type="dxa" w:w="5897880"/>
             <w:vAlign w:val="center"/>
+            <w:tcMar>
+              <w:top w:w="45" w:type="dxa"/>
+              <w:start w:w="65" w:type="dxa"/>
+              <w:bottom w:w="45" w:type="dxa"/>
+              <w:end w:w="65" w:type="dxa"/>
+            </w:tcMar>
           </w:tcPr>
           <w:p>
+            <w:pPr>
+              <w:spacing w:after="0" w:before="0" w:line="228" w:lineRule="auto"/>
+            </w:pPr>
             <w:r>
-              <w:t>Verify software environment and run static inference</w:t>
+              <w:rPr>
+                <w:rFonts w:ascii="Aptos" w:hAnsi="Aptos"/>
+                <w:sz w:val="17"/>
+              </w:rPr>
+              <w:t>Scan webcam indexes and save a raw camera frame</w:t>
             </w:r>
           </w:p>
         </w:tc>
       </w:tr>
       <w:tr>
+        <w:trPr>
+          <w:trHeight w:hRule="atLeast"/>
+        </w:trPr>
         <w:tc>
           <w:tcPr>
-            <w:tcW w:type="dxa" w:w="1872"/>
+            <w:tcW w:type="dxa" w:w="1417320"/>
             <w:vAlign w:val="center"/>
+            <w:tcMar>
+              <w:top w:w="45" w:type="dxa"/>
+              <w:start w:w="65" w:type="dxa"/>
+              <w:bottom w:w="45" w:type="dxa"/>
+              <w:end w:w="65" w:type="dxa"/>
+            </w:tcMar>
           </w:tcPr>
           <w:p>
+            <w:pPr>
+              <w:spacing w:after="0" w:before="0" w:line="228" w:lineRule="auto"/>
+            </w:pPr>
             <w:r>
-              <w:t>50-90 min</w:t>
+              <w:rPr>
+                <w:rFonts w:ascii="Aptos" w:hAnsi="Aptos"/>
+                <w:sz w:val="17"/>
+              </w:rPr>
+              <w:t>45-60 min</w:t>
             </w:r>
           </w:p>
         </w:tc>
         <w:tc>
           <w:tcPr>
-            <w:tcW w:type="dxa" w:w="8928"/>
+            <w:tcW w:type="dxa" w:w="5897880"/>
             <w:vAlign w:val="center"/>
+            <w:tcMar>
+              <w:top w:w="45" w:type="dxa"/>
+              <w:start w:w="65" w:type="dxa"/>
+              <w:bottom w:w="45" w:type="dxa"/>
+              <w:end w:w="65" w:type="dxa"/>
+            </w:tcMar>
           </w:tcPr>
           <w:p>
+            <w:pPr>
+              <w:spacing w:after="0" w:before="0" w:line="228" w:lineRule="auto"/>
+            </w:pPr>
             <w:r>
-              <w:t>Run live USB-webcam inference and capture evidence</w:t>
+              <w:rPr>
+                <w:rFonts w:ascii="Aptos" w:hAnsi="Aptos"/>
+                <w:sz w:val="17"/>
+              </w:rPr>
+              <w:t>Run pretrained YOLO26n baseline on the USB webcam</w:t>
             </w:r>
           </w:p>
         </w:tc>
       </w:tr>
       <w:tr>
+        <w:trPr>
+          <w:trHeight w:hRule="atLeast"/>
+        </w:trPr>
         <w:tc>
           <w:tcPr>
-            <w:tcW w:type="dxa" w:w="1872"/>
+            <w:tcW w:type="dxa" w:w="1417320"/>
             <w:vAlign w:val="center"/>
+            <w:tcMar>
+              <w:top w:w="45" w:type="dxa"/>
+              <w:start w:w="65" w:type="dxa"/>
+              <w:bottom w:w="45" w:type="dxa"/>
+              <w:end w:w="65" w:type="dxa"/>
+            </w:tcMar>
           </w:tcPr>
           <w:p>
+            <w:pPr>
+              <w:spacing w:after="0" w:before="0" w:line="228" w:lineRule="auto"/>
+            </w:pPr>
             <w:r>
-              <w:t>90-110 min</w:t>
+              <w:rPr>
+                <w:rFonts w:ascii="Aptos" w:hAnsi="Aptos"/>
+                <w:sz w:val="17"/>
+              </w:rPr>
+              <w:t>60-80 min</w:t>
             </w:r>
           </w:p>
         </w:tc>
         <w:tc>
           <w:tcPr>
-            <w:tcW w:type="dxa" w:w="8928"/>
+            <w:tcW w:type="dxa" w:w="5897880"/>
             <w:vAlign w:val="center"/>
+            <w:tcMar>
+              <w:top w:w="45" w:type="dxa"/>
+              <w:start w:w="65" w:type="dxa"/>
+              <w:bottom w:w="45" w:type="dxa"/>
+              <w:end w:w="65" w:type="dxa"/>
+            </w:tcMar>
           </w:tcPr>
           <w:p>
+            <w:pPr>
+              <w:spacing w:after="0" w:before="0" w:line="228" w:lineRule="auto"/>
+            </w:pPr>
             <w:r>
-              <w:t>Compare .pt and ONNX; observe confidence and temperature</w:t>
+              <w:rPr>
+                <w:rFonts w:ascii="Aptos" w:hAnsi="Aptos"/>
+                <w:sz w:val="17"/>
+              </w:rPr>
+              <w:t>Validate the custom model on static images</w:t>
             </w:r>
           </w:p>
         </w:tc>
       </w:tr>
       <w:tr>
+        <w:trPr>
+          <w:trHeight w:hRule="atLeast"/>
+        </w:trPr>
         <w:tc>
           <w:tcPr>
-            <w:tcW w:type="dxa" w:w="1872"/>
+            <w:tcW w:type="dxa" w:w="1417320"/>
             <w:vAlign w:val="center"/>
+            <w:tcMar>
+              <w:top w:w="45" w:type="dxa"/>
+              <w:start w:w="65" w:type="dxa"/>
+              <w:bottom w:w="45" w:type="dxa"/>
+              <w:end w:w="65" w:type="dxa"/>
+            </w:tcMar>
           </w:tcPr>
           <w:p>
+            <w:pPr>
+              <w:spacing w:after="0" w:before="0" w:line="228" w:lineRule="auto"/>
+            </w:pPr>
             <w:r>
-              <w:t>110-120 min</w:t>
+              <w:rPr>
+                <w:rFonts w:ascii="Aptos" w:hAnsi="Aptos"/>
+                <w:sz w:val="17"/>
+              </w:rPr>
+              <w:t>80-100 min</w:t>
             </w:r>
           </w:p>
         </w:tc>
         <w:tc>
           <w:tcPr>
-            <w:tcW w:type="dxa" w:w="8928"/>
+            <w:tcW w:type="dxa" w:w="5897880"/>
             <w:vAlign w:val="center"/>
+            <w:tcMar>
+              <w:top w:w="45" w:type="dxa"/>
+              <w:start w:w="65" w:type="dxa"/>
+              <w:bottom w:w="45" w:type="dxa"/>
+              <w:end w:w="65" w:type="dxa"/>
+            </w:tcMar>
           </w:tcPr>
           <w:p>
+            <w:pPr>
+              <w:spacing w:after="0" w:before="0" w:line="228" w:lineRule="auto"/>
+            </w:pPr>
             <w:r>
-              <w:t>Complete Session 2 notebook and PDF submission</w:t>
+              <w:rPr>
+                <w:rFonts w:ascii="Aptos" w:hAnsi="Aptos"/>
+                <w:sz w:val="17"/>
+              </w:rPr>
+              <w:t>Validate the custom model on recorded video and inspect saved outputs</w:t>
+            </w:r>
+          </w:p>
+        </w:tc>
+      </w:tr>
+      <w:tr>
+        <w:trPr>
+          <w:trHeight w:hRule="atLeast"/>
+        </w:trPr>
+        <w:tc>
+          <w:tcPr>
+            <w:tcW w:type="dxa" w:w="1417320"/>
+            <w:vAlign w:val="center"/>
+            <w:tcMar>
+              <w:top w:w="45" w:type="dxa"/>
+              <w:start w:w="65" w:type="dxa"/>
+              <w:bottom w:w="45" w:type="dxa"/>
+              <w:end w:w="65" w:type="dxa"/>
+            </w:tcMar>
+          </w:tcPr>
+          <w:p>
+            <w:pPr>
+              <w:spacing w:after="0" w:before="0" w:line="228" w:lineRule="auto"/>
+            </w:pPr>
+            <w:r>
+              <w:rPr>
+                <w:rFonts w:ascii="Aptos" w:hAnsi="Aptos"/>
+                <w:sz w:val="17"/>
+              </w:rPr>
+              <w:t>100-110 min</w:t>
+            </w:r>
+          </w:p>
+        </w:tc>
+        <w:tc>
+          <w:tcPr>
+            <w:tcW w:type="dxa" w:w="5897880"/>
+            <w:vAlign w:val="center"/>
+            <w:tcMar>
+              <w:top w:w="45" w:type="dxa"/>
+              <w:start w:w="65" w:type="dxa"/>
+              <w:bottom w:w="45" w:type="dxa"/>
+              <w:end w:w="65" w:type="dxa"/>
+            </w:tcMar>
+          </w:tcPr>
+          <w:p>
+            <w:pPr>
+              <w:spacing w:after="0" w:before="0" w:line="228" w:lineRule="auto"/>
+            </w:pPr>
+            <w:r>
+              <w:rPr>
+                <w:rFonts w:ascii="Aptos" w:hAnsi="Aptos"/>
+                <w:sz w:val="17"/>
+              </w:rPr>
+              <w:t>Run live custom-model USB-webcam inference</w:t>
+            </w:r>
+          </w:p>
+        </w:tc>
+      </w:tr>
+      <w:tr>
+        <w:trPr>
+          <w:trHeight w:hRule="atLeast"/>
+        </w:trPr>
+        <w:tc>
+          <w:tcPr>
+            <w:tcW w:type="dxa" w:w="1417320"/>
+            <w:vAlign w:val="center"/>
+            <w:tcMar>
+              <w:top w:w="45" w:type="dxa"/>
+              <w:start w:w="65" w:type="dxa"/>
+              <w:bottom w:w="45" w:type="dxa"/>
+              <w:end w:w="65" w:type="dxa"/>
+            </w:tcMar>
+          </w:tcPr>
+          <w:p>
+            <w:pPr>
+              <w:spacing w:after="0" w:before="0" w:line="228" w:lineRule="auto"/>
+            </w:pPr>
+            <w:r>
+              <w:rPr>
+                <w:rFonts w:ascii="Aptos" w:hAnsi="Aptos"/>
+                <w:sz w:val="17"/>
+              </w:rPr>
+              <w:t>110-117 min</w:t>
+            </w:r>
+          </w:p>
+        </w:tc>
+        <w:tc>
+          <w:tcPr>
+            <w:tcW w:type="dxa" w:w="5897880"/>
+            <w:vAlign w:val="center"/>
+            <w:tcMar>
+              <w:top w:w="45" w:type="dxa"/>
+              <w:start w:w="65" w:type="dxa"/>
+              <w:bottom w:w="45" w:type="dxa"/>
+              <w:end w:w="65" w:type="dxa"/>
+            </w:tcMar>
+          </w:tcPr>
+          <w:p>
+            <w:pPr>
+              <w:spacing w:after="0" w:before="0" w:line="228" w:lineRule="auto"/>
+            </w:pPr>
+            <w:r>
+              <w:rPr>
+                <w:rFonts w:ascii="Aptos" w:hAnsi="Aptos"/>
+                <w:sz w:val="17"/>
+              </w:rPr>
+              <w:t>Install ONNX Runtime; compare .pt and ONNX; test confidence and temperature</w:t>
+            </w:r>
+          </w:p>
+        </w:tc>
+      </w:tr>
+      <w:tr>
+        <w:trPr>
+          <w:trHeight w:hRule="atLeast"/>
+        </w:trPr>
+        <w:tc>
+          <w:tcPr>
+            <w:tcW w:type="dxa" w:w="1417320"/>
+            <w:vAlign w:val="center"/>
+            <w:tcMar>
+              <w:top w:w="45" w:type="dxa"/>
+              <w:start w:w="65" w:type="dxa"/>
+              <w:bottom w:w="45" w:type="dxa"/>
+              <w:end w:w="65" w:type="dxa"/>
+            </w:tcMar>
+          </w:tcPr>
+          <w:p>
+            <w:pPr>
+              <w:spacing w:after="0" w:before="0" w:line="228" w:lineRule="auto"/>
+            </w:pPr>
+            <w:r>
+              <w:rPr>
+                <w:rFonts w:ascii="Aptos" w:hAnsi="Aptos"/>
+                <w:sz w:val="17"/>
+              </w:rPr>
+              <w:t>117-120 min</w:t>
+            </w:r>
+          </w:p>
+        </w:tc>
+        <w:tc>
+          <w:tcPr>
+            <w:tcW w:type="dxa" w:w="5897880"/>
+            <w:vAlign w:val="center"/>
+            <w:tcMar>
+              <w:top w:w="45" w:type="dxa"/>
+              <w:start w:w="65" w:type="dxa"/>
+              <w:bottom w:w="45" w:type="dxa"/>
+              <w:end w:w="65" w:type="dxa"/>
+            </w:tcMar>
+          </w:tcPr>
+          <w:p>
+            <w:pPr>
+              <w:spacing w:after="0" w:before="0" w:line="228" w:lineRule="auto"/>
+            </w:pPr>
+            <w:r>
+              <w:rPr>
+                <w:rFonts w:ascii="Aptos" w:hAnsi="Aptos"/>
+                <w:sz w:val="17"/>
+              </w:rPr>
+              <w:t>Complete evidence and export the Session 2 PDF</w:t>
             </w:r>
           </w:p>
         </w:tc>
       </w:tr>
     </w:tbl>
-    <w:p/>
+    <w:p>
+      <w:r>
+        <w:br w:type="page"/>
+      </w:r>
+    </w:p>
     <w:p>
       <w:pPr>
         <w:pStyle w:val="Heading2"/>
+        <w:keepNext/>
       </w:pPr>
       <w:r>
         <w:t>5.1 Required Session 2 workflow</w:t>
@@ -1279,95 +2623,973 @@
     </w:p>
     <w:p>
       <w:pPr>
-        <w:pStyle w:val="ListNumber"/>
+        <w:keepLines/>
+        <w:spacing w:after="20"/>
+        <w:ind w:left="346" w:hanging="346"/>
       </w:pPr>
       <w:r>
-        <w:t>Enter group/fork information and the Session 1 commit ID in the Session 2 notebook.</w:t>
+        <w:rPr>
+          <w:b/>
+        </w:rPr>
+        <w:t xml:space="preserve">1. </w:t>
+      </w:r>
+      <w:r>
+        <w:t>Open the group fork on GitHub and select Sync fork -&gt; Update branch.</w:t>
       </w:r>
     </w:p>
     <w:p>
       <w:pPr>
-        <w:pStyle w:val="ListNumber"/>
+        <w:keepLines/>
+        <w:spacing w:after="20"/>
+        <w:ind w:left="346" w:hanging="346"/>
       </w:pPr>
       <w:r>
-        <w:t>Record Raspberry Pi model, architecture, Python version, and initial temperature.</w:t>
+        <w:rPr>
+          <w:b/>
+        </w:rPr>
+        <w:t xml:space="preserve">2. </w:t>
+      </w:r>
+      <w:r>
+        <w:t>Clone the synchronized public group fork into ~/lab4-megalopa-student.</w:t>
       </w:r>
     </w:p>
     <w:p>
       <w:pPr>
-        <w:pStyle w:val="ListNumber"/>
+        <w:keepLines/>
+        <w:spacing w:after="20"/>
+        <w:ind w:left="346" w:hanging="346"/>
       </w:pPr>
       <w:r>
-        <w:t>Verify the USB webcam and save a raw test image.</w:t>
+        <w:rPr>
+          <w:b/>
+        </w:rPr>
+        <w:t xml:space="preserve">3. </w:t>
+      </w:r>
+      <w:r>
+        <w:t>Record the group fork URL, the Session 1 training commit, and the synchronized Session 2 commit.</w:t>
       </w:r>
     </w:p>
     <w:p>
       <w:pPr>
-        <w:pStyle w:val="ListNumber"/>
+        <w:keepLines/>
+        <w:spacing w:after="20"/>
+        <w:ind w:left="346" w:hanging="346"/>
       </w:pPr>
       <w:r>
-        <w:t>Clone the public group fork on the Pi.</w:t>
+        <w:rPr>
+          <w:b/>
+        </w:rPr>
+        <w:t xml:space="preserve">4. </w:t>
+      </w:r>
+      <w:r>
+        <w:t>Verify shared/models/yolo26n.pt, the updated deployment script, custom .pt/.onnx models, validation images, and at least one validation video.</w:t>
       </w:r>
     </w:p>
     <w:p>
       <w:pPr>
-        <w:pStyle w:val="ListNumber"/>
+        <w:keepLines/>
+        <w:spacing w:after="20"/>
+        <w:ind w:left="346" w:hanging="346"/>
       </w:pPr>
       <w:r>
-        <w:t>Confirm the Pi commit matches the Session 1 commit ID.</w:t>
+        <w:rPr>
+          <w:b/>
+        </w:rPr>
+        <w:t xml:space="preserve">5. </w:t>
+      </w:r>
+      <w:r>
+        <w:t>Create a clean project .venv without using apt.</w:t>
       </w:r>
     </w:p>
     <w:p>
       <w:pPr>
-        <w:pStyle w:val="ListNumber"/>
+        <w:keepLines/>
+        <w:spacing w:after="20"/>
+        <w:ind w:left="346" w:hanging="346"/>
       </w:pPr>
       <w:r>
-        <w:t>Verify best.pt and ONNX files under student_work/models/.</w:t>
+        <w:rPr>
+          <w:b/>
+        </w:rPr>
+        <w:t xml:space="preserve">6. </w:t>
+      </w:r>
+      <w:r>
+        <w:t>Install torch and torchvision from the official CPU-only PyTorch index before installing Ultralytics.</w:t>
       </w:r>
     </w:p>
     <w:p>
       <w:pPr>
-        <w:pStyle w:val="ListNumber"/>
+        <w:keepLines/>
+        <w:spacing w:after="20"/>
+        <w:ind w:left="346" w:hanging="346"/>
       </w:pPr>
       <w:r>
-        <w:t>Run static-image inference before live inference.</w:t>
+        <w:rPr>
+          <w:b/>
+        </w:rPr>
+        <w:t xml:space="preserve">7. </w:t>
+      </w:r>
+      <w:r>
+        <w:t>Verify CUDA available: False, PyTorch CUDA version: None, and CPU-only environment: PASSED.</w:t>
       </w:r>
     </w:p>
     <w:p>
       <w:pPr>
-        <w:pStyle w:val="ListNumber"/>
+        <w:keepLines/>
+        <w:spacing w:after="20"/>
+        <w:ind w:left="346" w:hanging="346"/>
       </w:pPr>
       <w:r>
-        <w:t>Run the local USB-webcam detection window; press S to save and Q to stop.</w:t>
+        <w:rPr>
+          <w:b/>
+        </w:rPr>
+        <w:t xml:space="preserve">8. </w:t>
+      </w:r>
+      <w:r>
+        <w:t>Do not treat nvidia-ml-py as a CUDA runtime error; it is a small monitoring dependency and may remain installed.</w:t>
       </w:r>
     </w:p>
     <w:p>
       <w:pPr>
-        <w:pStyle w:val="ListNumber"/>
+        <w:keepLines/>
+        <w:spacing w:after="20"/>
+        <w:ind w:left="346" w:hanging="346"/>
       </w:pPr>
       <w:r>
-        <w:t>Compare .pt and ONNX under the same conditions.</w:t>
+        <w:rPr>
+          <w:b/>
+        </w:rPr>
+        <w:t xml:space="preserve">9. </w:t>
+      </w:r>
+      <w:r>
+        <w:t>Run --scan-cameras and record a camera index that returns a valid frame.</w:t>
       </w:r>
     </w:p>
     <w:p>
       <w:pPr>
-        <w:pStyle w:val="ListNumber"/>
+        <w:keepLines/>
+        <w:spacing w:after="20"/>
+        <w:ind w:left="346" w:hanging="346"/>
       </w:pPr>
       <w:r>
-        <w:t>Upload screenshots/photographs to the Session 2 notebook.</w:t>
+        <w:rPr>
+          <w:b/>
+        </w:rPr>
+        <w:t xml:space="preserve">10. </w:t>
+      </w:r>
+      <w:r>
+        <w:t>Run the pretrained baseline using shared/models/yolo26n.pt and save evidence.</w:t>
       </w:r>
     </w:p>
     <w:p>
       <w:pPr>
-        <w:pStyle w:val="ListNumber"/>
+        <w:keepLines/>
+        <w:spacing w:after="20"/>
+        <w:ind w:left="346" w:hanging="346"/>
       </w:pPr>
       <w:r>
-        <w:t>Print the completed notebook as SecXX_GroupXX_Lab4_Session2.pdf.</w:t>
+        <w:rPr>
+          <w:b/>
+        </w:rPr>
+        <w:t xml:space="preserve">11. </w:t>
+      </w:r>
+      <w:r>
+        <w:t>Validate the custom model on a supplied static image before live testing.</w:t>
       </w:r>
     </w:p>
     <w:p>
       <w:pPr>
+        <w:keepLines/>
+        <w:spacing w:after="20"/>
+        <w:ind w:left="346" w:hanging="346"/>
+      </w:pPr>
+      <w:r>
+        <w:rPr>
+          <w:b/>
+        </w:rPr>
+        <w:t xml:space="preserve">12. </w:t>
+      </w:r>
+      <w:r>
+        <w:t>Validate the custom model on a supplied recorded video and inspect the annotated video, JSON summary, and frame-metrics CSV.</w:t>
+      </w:r>
+    </w:p>
+    <w:p>
+      <w:pPr>
+        <w:keepLines/>
+        <w:spacing w:after="20"/>
+        <w:ind w:left="346" w:hanging="346"/>
+      </w:pPr>
+      <w:r>
+        <w:rPr>
+          <w:b/>
+        </w:rPr>
+        <w:t xml:space="preserve">13. </w:t>
+      </w:r>
+      <w:r>
+        <w:t>Run the custom model with the live USB webcam and save at least one annotated frame.</w:t>
+      </w:r>
+    </w:p>
+    <w:p>
+      <w:pPr>
+        <w:keepLines/>
+        <w:spacing w:after="20"/>
+        <w:ind w:left="346" w:hanging="346"/>
+      </w:pPr>
+      <w:r>
+        <w:rPr>
+          <w:b/>
+        </w:rPr>
+        <w:t xml:space="preserve">14. </w:t>
+      </w:r>
+      <w:r>
+        <w:t>Install ONNX Runtime only when the .pt versus ONNX comparison begins.</w:t>
+      </w:r>
+    </w:p>
+    <w:p>
+      <w:pPr>
+        <w:keepLines/>
+        <w:spacing w:after="20"/>
+        <w:ind w:left="346" w:hanging="346"/>
+      </w:pPr>
+      <w:r>
+        <w:rPr>
+          <w:b/>
+        </w:rPr>
+        <w:t xml:space="preserve">15. </w:t>
+      </w:r>
+      <w:r>
+        <w:t>Repeat one controlled test with another confidence threshold and record the final Raspberry Pi temperature.</w:t>
+      </w:r>
+    </w:p>
+    <w:p>
+      <w:pPr>
+        <w:keepLines/>
+        <w:spacing w:after="20"/>
+        <w:ind w:left="346" w:hanging="346"/>
+      </w:pPr>
+      <w:r>
+        <w:rPr>
+          <w:b/>
+        </w:rPr>
+        <w:t xml:space="preserve">16. </w:t>
+      </w:r>
+      <w:r>
+        <w:t>Upload evidence to the notebook and print it as SecXX_GroupXX_Lab4_Session2.pdf.</w:t>
+      </w:r>
+    </w:p>
+    <w:p>
+      <w:pPr>
+        <w:pStyle w:val="Heading2"/>
+        <w:keepNext/>
+      </w:pPr>
+      <w:r>
+        <w:t>5.2 Static-image display behaviour</w:t>
+      </w:r>
+    </w:p>
+    <w:p>
+      <w:pPr>
+        <w:pStyle w:val="ListBullet"/>
+        <w:keepLines/>
+        <w:spacing w:after="20"/>
+      </w:pPr>
+      <w:r>
+        <w:t>The preview uses a movable OpenCV WINDOW_NORMAL window.</w:t>
+      </w:r>
+    </w:p>
+    <w:p>
+      <w:pPr>
+        <w:pStyle w:val="ListBullet"/>
+        <w:keepLines/>
+        <w:spacing w:after="20"/>
+      </w:pPr>
+      <w:r>
+        <w:t>The preview is positioned near the top-left corner and fitted to approximately 760 x 420 pixels.</w:t>
+      </w:r>
+    </w:p>
+    <w:p>
+      <w:pPr>
+        <w:pStyle w:val="ListBullet"/>
+        <w:keepLines/>
+        <w:spacing w:after="20"/>
+      </w:pPr>
+      <w:r>
+        <w:t>Saved annotated images retain their full output resolution.</w:t>
+      </w:r>
+    </w:p>
+    <w:p>
+      <w:pPr>
+        <w:pStyle w:val="ListBullet"/>
+        <w:keepLines/>
+        <w:spacing w:after="20"/>
+      </w:pPr>
+      <w:r>
+        <w:t>Press Q, Esc, Enter, or Space to close a static preview.</w:t>
+      </w:r>
+    </w:p>
+    <w:p>
+      <w:pPr>
+        <w:pStyle w:val="ListBullet"/>
+        <w:keepLines/>
+        <w:spacing w:after="20"/>
+      </w:pPr>
+      <w:r>
+        <w:t>Use --no-display when only saved outputs are required or the desktop window is not usable.</w:t>
+      </w:r>
+    </w:p>
+    <w:p>
+      <w:pPr>
+        <w:pStyle w:val="Heading2"/>
+        <w:keepNext/>
+      </w:pPr>
+      <w:r>
+        <w:t>5.3 Recorded-video validation outputs</w:t>
+      </w:r>
+    </w:p>
+    <w:p>
+      <w:r>
+        <w:t>For each validation video, the deployment script produces the following evidence under student_work/results/pi5/custom/:</w:t>
+      </w:r>
+    </w:p>
+    <w:tbl>
+      <w:tblPr>
+        <w:tblStyle w:val="TableGrid"/>
+        <w:tblW w:type="auto" w:w="0"/>
+        <w:tblLayout w:type="fixed"/>
+        <w:tblLook w:firstColumn="1" w:firstRow="1" w:lastColumn="0" w:lastRow="0" w:noHBand="0" w:noVBand="1" w:val="04A0"/>
+      </w:tblPr>
+      <w:tblGrid>
+        <w:gridCol w:w="5184"/>
+        <w:gridCol w:w="5184"/>
+      </w:tblGrid>
+      <w:tr>
+        <w:trPr>
+          <w:trHeight w:hRule="atLeast"/>
+          <w:tblHeader w:val="true"/>
+        </w:trPr>
+        <w:tc>
+          <w:tcPr>
+            <w:tcW w:type="dxa" w:w="2880360"/>
+            <w:vAlign w:val="center"/>
+            <w:tcMar>
+              <w:top w:w="45" w:type="dxa"/>
+              <w:start w:w="65" w:type="dxa"/>
+              <w:bottom w:w="45" w:type="dxa"/>
+              <w:end w:w="65" w:type="dxa"/>
+            </w:tcMar>
+            <w:shd w:fill="D9EAF7"/>
+          </w:tcPr>
+          <w:p>
+            <w:pPr>
+              <w:spacing w:after="0" w:before="0" w:line="228" w:lineRule="auto"/>
+            </w:pPr>
+            <w:r>
+              <w:rPr>
+                <w:rFonts w:ascii="Aptos" w:hAnsi="Aptos"/>
+                <w:b/>
+                <w:sz w:val="17"/>
+              </w:rPr>
+              <w:t>Output</w:t>
+            </w:r>
+          </w:p>
+        </w:tc>
+        <w:tc>
+          <w:tcPr>
+            <w:tcW w:type="dxa" w:w="4434840"/>
+            <w:vAlign w:val="center"/>
+            <w:tcMar>
+              <w:top w:w="45" w:type="dxa"/>
+              <w:start w:w="65" w:type="dxa"/>
+              <w:bottom w:w="45" w:type="dxa"/>
+              <w:end w:w="65" w:type="dxa"/>
+            </w:tcMar>
+            <w:shd w:fill="D9EAF7"/>
+          </w:tcPr>
+          <w:p>
+            <w:pPr>
+              <w:spacing w:after="0" w:before="0" w:line="228" w:lineRule="auto"/>
+            </w:pPr>
+            <w:r>
+              <w:rPr>
+                <w:rFonts w:ascii="Aptos" w:hAnsi="Aptos"/>
+                <w:b/>
+                <w:sz w:val="17"/>
+              </w:rPr>
+              <w:t>Evidence provided</w:t>
+            </w:r>
+          </w:p>
+        </w:tc>
+      </w:tr>
+      <w:tr>
+        <w:trPr>
+          <w:trHeight w:hRule="atLeast"/>
+        </w:trPr>
+        <w:tc>
+          <w:tcPr>
+            <w:tcW w:type="dxa" w:w="2880360"/>
+            <w:vAlign w:val="center"/>
+            <w:tcMar>
+              <w:top w:w="45" w:type="dxa"/>
+              <w:start w:w="65" w:type="dxa"/>
+              <w:bottom w:w="45" w:type="dxa"/>
+              <w:end w:w="65" w:type="dxa"/>
+            </w:tcMar>
+          </w:tcPr>
+          <w:p>
+            <w:pPr>
+              <w:spacing w:after="0" w:before="0" w:line="228" w:lineRule="auto"/>
+            </w:pPr>
+            <w:r>
+              <w:rPr>
+                <w:rFonts w:ascii="Aptos" w:hAnsi="Aptos"/>
+                <w:sz w:val="17"/>
+              </w:rPr>
+              <w:t>video_&lt;name&gt;_annotated.mp4 or .avi</w:t>
+            </w:r>
+          </w:p>
+        </w:tc>
+        <w:tc>
+          <w:tcPr>
+            <w:tcW w:type="dxa" w:w="4434840"/>
+            <w:vAlign w:val="center"/>
+            <w:tcMar>
+              <w:top w:w="45" w:type="dxa"/>
+              <w:start w:w="65" w:type="dxa"/>
+              <w:bottom w:w="45" w:type="dxa"/>
+              <w:end w:w="65" w:type="dxa"/>
+            </w:tcMar>
+          </w:tcPr>
+          <w:p>
+            <w:pPr>
+              <w:spacing w:after="0" w:before="0" w:line="228" w:lineRule="auto"/>
+            </w:pPr>
+            <w:r>
+              <w:rPr>
+                <w:rFonts w:ascii="Aptos" w:hAnsi="Aptos"/>
+                <w:sz w:val="17"/>
+              </w:rPr>
+              <w:t>Frame-by-frame model predictions over the recorded clip</w:t>
+            </w:r>
+          </w:p>
+        </w:tc>
+      </w:tr>
+      <w:tr>
+        <w:trPr>
+          <w:trHeight w:hRule="atLeast"/>
+        </w:trPr>
+        <w:tc>
+          <w:tcPr>
+            <w:tcW w:type="dxa" w:w="2880360"/>
+            <w:vAlign w:val="center"/>
+            <w:tcMar>
+              <w:top w:w="45" w:type="dxa"/>
+              <w:start w:w="65" w:type="dxa"/>
+              <w:bottom w:w="45" w:type="dxa"/>
+              <w:end w:w="65" w:type="dxa"/>
+            </w:tcMar>
+          </w:tcPr>
+          <w:p>
+            <w:pPr>
+              <w:spacing w:after="0" w:before="0" w:line="228" w:lineRule="auto"/>
+            </w:pPr>
+            <w:r>
+              <w:rPr>
+                <w:rFonts w:ascii="Aptos" w:hAnsi="Aptos"/>
+                <w:sz w:val="17"/>
+              </w:rPr>
+              <w:t>video_&lt;name&gt;_summary.json</w:t>
+            </w:r>
+          </w:p>
+        </w:tc>
+        <w:tc>
+          <w:tcPr>
+            <w:tcW w:type="dxa" w:w="4434840"/>
+            <w:vAlign w:val="center"/>
+            <w:tcMar>
+              <w:top w:w="45" w:type="dxa"/>
+              <w:start w:w="65" w:type="dxa"/>
+              <w:bottom w:w="45" w:type="dxa"/>
+              <w:end w:w="65" w:type="dxa"/>
+            </w:tcMar>
+          </w:tcPr>
+          <w:p>
+            <w:pPr>
+              <w:spacing w:after="0" w:before="0" w:line="228" w:lineRule="auto"/>
+            </w:pPr>
+            <w:r>
+              <w:rPr>
+                <w:rFonts w:ascii="Aptos" w:hAnsi="Aptos"/>
+                <w:sz w:val="17"/>
+              </w:rPr>
+              <w:t>Source FPS, frames processed, average latency, inference FPS, end-to-end FPS, and count statistics</w:t>
+            </w:r>
+          </w:p>
+        </w:tc>
+      </w:tr>
+      <w:tr>
+        <w:trPr>
+          <w:trHeight w:hRule="atLeast"/>
+        </w:trPr>
+        <w:tc>
+          <w:tcPr>
+            <w:tcW w:type="dxa" w:w="2880360"/>
+            <w:vAlign w:val="center"/>
+            <w:tcMar>
+              <w:top w:w="45" w:type="dxa"/>
+              <w:start w:w="65" w:type="dxa"/>
+              <w:bottom w:w="45" w:type="dxa"/>
+              <w:end w:w="65" w:type="dxa"/>
+            </w:tcMar>
+          </w:tcPr>
+          <w:p>
+            <w:pPr>
+              <w:spacing w:after="0" w:before="0" w:line="228" w:lineRule="auto"/>
+            </w:pPr>
+            <w:r>
+              <w:rPr>
+                <w:rFonts w:ascii="Aptos" w:hAnsi="Aptos"/>
+                <w:sz w:val="17"/>
+              </w:rPr>
+              <w:t>video_&lt;name&gt;_frame_metrics.csv</w:t>
+            </w:r>
+          </w:p>
+        </w:tc>
+        <w:tc>
+          <w:tcPr>
+            <w:tcW w:type="dxa" w:w="4434840"/>
+            <w:vAlign w:val="center"/>
+            <w:tcMar>
+              <w:top w:w="45" w:type="dxa"/>
+              <w:start w:w="65" w:type="dxa"/>
+              <w:bottom w:w="45" w:type="dxa"/>
+              <w:end w:w="65" w:type="dxa"/>
+            </w:tcMar>
+          </w:tcPr>
+          <w:p>
+            <w:pPr>
+              <w:spacing w:after="0" w:before="0" w:line="228" w:lineRule="auto"/>
+            </w:pPr>
+            <w:r>
+              <w:rPr>
+                <w:rFonts w:ascii="Aptos" w:hAnsi="Aptos"/>
+                <w:sz w:val="17"/>
+              </w:rPr>
+              <w:t>Per-frame timestamp, total detections, class counts, latency, and rolling inference FPS</w:t>
+            </w:r>
+          </w:p>
+        </w:tc>
+      </w:tr>
+    </w:tbl>
+    <w:p>
+      <w:r>
+        <w:br w:type="page"/>
+      </w:r>
+    </w:p>
+    <w:p>
+      <w:pPr>
+        <w:pStyle w:val="Heading2"/>
+        <w:keepNext/>
+      </w:pPr>
+      <w:r>
+        <w:t>5.4 Key Session 2 commands</w:t>
+      </w:r>
+    </w:p>
+    <w:p>
+      <w:r>
+        <w:t>The notebook contains the complete commands. These shortened forms identify the required operating modes:</w:t>
+      </w:r>
+    </w:p>
+    <w:tbl>
+      <w:tblPr>
+        <w:tblStyle w:val="TableGrid"/>
+        <w:tblW w:type="auto" w:w="0"/>
+        <w:tblLayout w:type="fixed"/>
+        <w:tblLook w:firstColumn="1" w:firstRow="1" w:lastColumn="0" w:lastRow="0" w:noHBand="0" w:noVBand="1" w:val="04A0"/>
+      </w:tblPr>
+      <w:tblGrid>
+        <w:gridCol w:w="5184"/>
+        <w:gridCol w:w="5184"/>
+      </w:tblGrid>
+      <w:tr>
+        <w:trPr>
+          <w:trHeight w:hRule="atLeast"/>
+          <w:tblHeader w:val="true"/>
+        </w:trPr>
+        <w:tc>
+          <w:tcPr>
+            <w:tcW w:type="dxa" w:w="1828800"/>
+            <w:vAlign w:val="center"/>
+            <w:tcMar>
+              <w:top w:w="45" w:type="dxa"/>
+              <w:start w:w="65" w:type="dxa"/>
+              <w:bottom w:w="45" w:type="dxa"/>
+              <w:end w:w="65" w:type="dxa"/>
+            </w:tcMar>
+            <w:shd w:fill="D9EAF7"/>
+          </w:tcPr>
+          <w:p>
+            <w:pPr>
+              <w:spacing w:after="0" w:before="0" w:line="228" w:lineRule="auto"/>
+            </w:pPr>
+            <w:r>
+              <w:rPr>
+                <w:rFonts w:ascii="Aptos" w:hAnsi="Aptos"/>
+                <w:b/>
+                <w:sz w:val="17"/>
+              </w:rPr>
+              <w:t>Purpose</w:t>
+            </w:r>
+          </w:p>
+        </w:tc>
+        <w:tc>
+          <w:tcPr>
+            <w:tcW w:type="dxa" w:w="5486400"/>
+            <w:vAlign w:val="center"/>
+            <w:tcMar>
+              <w:top w:w="45" w:type="dxa"/>
+              <w:start w:w="65" w:type="dxa"/>
+              <w:bottom w:w="45" w:type="dxa"/>
+              <w:end w:w="65" w:type="dxa"/>
+            </w:tcMar>
+            <w:shd w:fill="D9EAF7"/>
+          </w:tcPr>
+          <w:p>
+            <w:pPr>
+              <w:spacing w:after="0" w:before="0" w:line="228" w:lineRule="auto"/>
+            </w:pPr>
+            <w:r>
+              <w:rPr>
+                <w:rFonts w:ascii="Aptos" w:hAnsi="Aptos"/>
+                <w:b/>
+                <w:sz w:val="17"/>
+              </w:rPr>
+              <w:t>Command pattern</w:t>
+            </w:r>
+          </w:p>
+        </w:tc>
+      </w:tr>
+      <w:tr>
+        <w:trPr>
+          <w:trHeight w:hRule="atLeast"/>
+        </w:trPr>
+        <w:tc>
+          <w:tcPr>
+            <w:tcW w:type="dxa" w:w="1828800"/>
+            <w:vAlign w:val="center"/>
+            <w:tcMar>
+              <w:top w:w="45" w:type="dxa"/>
+              <w:start w:w="65" w:type="dxa"/>
+              <w:bottom w:w="45" w:type="dxa"/>
+              <w:end w:w="65" w:type="dxa"/>
+            </w:tcMar>
+          </w:tcPr>
+          <w:p>
+            <w:pPr>
+              <w:spacing w:after="0" w:before="0" w:line="228" w:lineRule="auto"/>
+            </w:pPr>
+            <w:r>
+              <w:rPr>
+                <w:rFonts w:ascii="Aptos" w:hAnsi="Aptos"/>
+                <w:sz w:val="17"/>
+              </w:rPr>
+              <w:t>Scan cameras</w:t>
+            </w:r>
+          </w:p>
+        </w:tc>
+        <w:tc>
+          <w:tcPr>
+            <w:tcW w:type="dxa" w:w="5486400"/>
+            <w:vAlign w:val="center"/>
+            <w:tcMar>
+              <w:top w:w="45" w:type="dxa"/>
+              <w:start w:w="65" w:type="dxa"/>
+              <w:bottom w:w="45" w:type="dxa"/>
+              <w:end w:w="65" w:type="dxa"/>
+            </w:tcMar>
+          </w:tcPr>
+          <w:p>
+            <w:pPr>
+              <w:spacing w:after="0" w:before="0" w:line="228" w:lineRule="auto"/>
+            </w:pPr>
+            <w:r>
+              <w:rPr>
+                <w:rFonts w:ascii="Aptos" w:hAnsi="Aptos"/>
+                <w:sz w:val="17"/>
+              </w:rPr>
+              <w:t>python shared/pi5/megalopa_detection_usb.py --scan-cameras</w:t>
+            </w:r>
+          </w:p>
+        </w:tc>
+      </w:tr>
+      <w:tr>
+        <w:trPr>
+          <w:trHeight w:hRule="atLeast"/>
+        </w:trPr>
+        <w:tc>
+          <w:tcPr>
+            <w:tcW w:type="dxa" w:w="1828800"/>
+            <w:vAlign w:val="center"/>
+            <w:tcMar>
+              <w:top w:w="45" w:type="dxa"/>
+              <w:start w:w="65" w:type="dxa"/>
+              <w:bottom w:w="45" w:type="dxa"/>
+              <w:end w:w="65" w:type="dxa"/>
+            </w:tcMar>
+          </w:tcPr>
+          <w:p>
+            <w:pPr>
+              <w:spacing w:after="0" w:before="0" w:line="228" w:lineRule="auto"/>
+            </w:pPr>
+            <w:r>
+              <w:rPr>
+                <w:rFonts w:ascii="Aptos" w:hAnsi="Aptos"/>
+                <w:sz w:val="17"/>
+              </w:rPr>
+              <w:t>Baseline webcam</w:t>
+            </w:r>
+          </w:p>
+        </w:tc>
+        <w:tc>
+          <w:tcPr>
+            <w:tcW w:type="dxa" w:w="5486400"/>
+            <w:vAlign w:val="center"/>
+            <w:tcMar>
+              <w:top w:w="45" w:type="dxa"/>
+              <w:start w:w="65" w:type="dxa"/>
+              <w:bottom w:w="45" w:type="dxa"/>
+              <w:end w:w="65" w:type="dxa"/>
+            </w:tcMar>
+          </w:tcPr>
+          <w:p>
+            <w:pPr>
+              <w:spacing w:after="0" w:before="0" w:line="228" w:lineRule="auto"/>
+            </w:pPr>
+            <w:r>
+              <w:rPr>
+                <w:rFonts w:ascii="Aptos" w:hAnsi="Aptos"/>
+                <w:sz w:val="17"/>
+              </w:rPr>
+              <w:t>python shared/pi5/megalopa_detection_usb.py --baseline --mode camera --camera-index N</w:t>
+            </w:r>
+          </w:p>
+        </w:tc>
+      </w:tr>
+      <w:tr>
+        <w:trPr>
+          <w:trHeight w:hRule="atLeast"/>
+        </w:trPr>
+        <w:tc>
+          <w:tcPr>
+            <w:tcW w:type="dxa" w:w="1828800"/>
+            <w:vAlign w:val="center"/>
+            <w:tcMar>
+              <w:top w:w="45" w:type="dxa"/>
+              <w:start w:w="65" w:type="dxa"/>
+              <w:bottom w:w="45" w:type="dxa"/>
+              <w:end w:w="65" w:type="dxa"/>
+            </w:tcMar>
+          </w:tcPr>
+          <w:p>
+            <w:pPr>
+              <w:spacing w:after="0" w:before="0" w:line="228" w:lineRule="auto"/>
+            </w:pPr>
+            <w:r>
+              <w:rPr>
+                <w:rFonts w:ascii="Aptos" w:hAnsi="Aptos"/>
+                <w:sz w:val="17"/>
+              </w:rPr>
+              <w:t>Static image</w:t>
+            </w:r>
+          </w:p>
+        </w:tc>
+        <w:tc>
+          <w:tcPr>
+            <w:tcW w:type="dxa" w:w="5486400"/>
+            <w:vAlign w:val="center"/>
+            <w:tcMar>
+              <w:top w:w="45" w:type="dxa"/>
+              <w:start w:w="65" w:type="dxa"/>
+              <w:bottom w:w="45" w:type="dxa"/>
+              <w:end w:w="65" w:type="dxa"/>
+            </w:tcMar>
+          </w:tcPr>
+          <w:p>
+            <w:pPr>
+              <w:spacing w:after="0" w:before="0" w:line="228" w:lineRule="auto"/>
+            </w:pPr>
+            <w:r>
+              <w:rPr>
+                <w:rFonts w:ascii="Aptos" w:hAnsi="Aptos"/>
+                <w:sz w:val="17"/>
+              </w:rPr>
+              <w:t>python shared/pi5/megalopa_detection_usb.py --mode image --image-index 1</w:t>
+            </w:r>
+          </w:p>
+        </w:tc>
+      </w:tr>
+      <w:tr>
+        <w:trPr>
+          <w:trHeight w:hRule="atLeast"/>
+        </w:trPr>
+        <w:tc>
+          <w:tcPr>
+            <w:tcW w:type="dxa" w:w="1828800"/>
+            <w:vAlign w:val="center"/>
+            <w:tcMar>
+              <w:top w:w="45" w:type="dxa"/>
+              <w:start w:w="65" w:type="dxa"/>
+              <w:bottom w:w="45" w:type="dxa"/>
+              <w:end w:w="65" w:type="dxa"/>
+            </w:tcMar>
+          </w:tcPr>
+          <w:p>
+            <w:pPr>
+              <w:spacing w:after="0" w:before="0" w:line="228" w:lineRule="auto"/>
+            </w:pPr>
+            <w:r>
+              <w:rPr>
+                <w:rFonts w:ascii="Aptos" w:hAnsi="Aptos"/>
+                <w:sz w:val="17"/>
+              </w:rPr>
+              <w:t>Recorded video</w:t>
+            </w:r>
+          </w:p>
+        </w:tc>
+        <w:tc>
+          <w:tcPr>
+            <w:tcW w:type="dxa" w:w="5486400"/>
+            <w:vAlign w:val="center"/>
+            <w:tcMar>
+              <w:top w:w="45" w:type="dxa"/>
+              <w:start w:w="65" w:type="dxa"/>
+              <w:bottom w:w="45" w:type="dxa"/>
+              <w:end w:w="65" w:type="dxa"/>
+            </w:tcMar>
+          </w:tcPr>
+          <w:p>
+            <w:pPr>
+              <w:spacing w:after="0" w:before="0" w:line="228" w:lineRule="auto"/>
+            </w:pPr>
+            <w:r>
+              <w:rPr>
+                <w:rFonts w:ascii="Aptos" w:hAnsi="Aptos"/>
+                <w:sz w:val="17"/>
+              </w:rPr>
+              <w:t>python shared/pi5/megalopa_detection_usb.py --mode video --video-index 1</w:t>
+            </w:r>
+          </w:p>
+        </w:tc>
+      </w:tr>
+      <w:tr>
+        <w:trPr>
+          <w:trHeight w:hRule="atLeast"/>
+        </w:trPr>
+        <w:tc>
+          <w:tcPr>
+            <w:tcW w:type="dxa" w:w="1828800"/>
+            <w:vAlign w:val="center"/>
+            <w:tcMar>
+              <w:top w:w="45" w:type="dxa"/>
+              <w:start w:w="65" w:type="dxa"/>
+              <w:bottom w:w="45" w:type="dxa"/>
+              <w:end w:w="65" w:type="dxa"/>
+            </w:tcMar>
+          </w:tcPr>
+          <w:p>
+            <w:pPr>
+              <w:spacing w:after="0" w:before="0" w:line="228" w:lineRule="auto"/>
+            </w:pPr>
+            <w:r>
+              <w:rPr>
+                <w:rFonts w:ascii="Aptos" w:hAnsi="Aptos"/>
+                <w:sz w:val="17"/>
+              </w:rPr>
+              <w:t>Custom webcam</w:t>
+            </w:r>
+          </w:p>
+        </w:tc>
+        <w:tc>
+          <w:tcPr>
+            <w:tcW w:type="dxa" w:w="5486400"/>
+            <w:vAlign w:val="center"/>
+            <w:tcMar>
+              <w:top w:w="45" w:type="dxa"/>
+              <w:start w:w="65" w:type="dxa"/>
+              <w:bottom w:w="45" w:type="dxa"/>
+              <w:end w:w="65" w:type="dxa"/>
+            </w:tcMar>
+          </w:tcPr>
+          <w:p>
+            <w:pPr>
+              <w:spacing w:after="0" w:before="0" w:line="228" w:lineRule="auto"/>
+            </w:pPr>
+            <w:r>
+              <w:rPr>
+                <w:rFonts w:ascii="Aptos" w:hAnsi="Aptos"/>
+                <w:sz w:val="17"/>
+              </w:rPr>
+              <w:t>python shared/pi5/megalopa_detection_usb.py --mode camera --camera-index N</w:t>
+            </w:r>
+          </w:p>
+        </w:tc>
+      </w:tr>
+      <w:tr>
+        <w:trPr>
+          <w:trHeight w:hRule="atLeast"/>
+        </w:trPr>
+        <w:tc>
+          <w:tcPr>
+            <w:tcW w:type="dxa" w:w="1828800"/>
+            <w:vAlign w:val="center"/>
+            <w:tcMar>
+              <w:top w:w="45" w:type="dxa"/>
+              <w:start w:w="65" w:type="dxa"/>
+              <w:bottom w:w="45" w:type="dxa"/>
+              <w:end w:w="65" w:type="dxa"/>
+            </w:tcMar>
+          </w:tcPr>
+          <w:p>
+            <w:pPr>
+              <w:spacing w:after="0" w:before="0" w:line="228" w:lineRule="auto"/>
+            </w:pPr>
+            <w:r>
+              <w:rPr>
+                <w:rFonts w:ascii="Aptos" w:hAnsi="Aptos"/>
+                <w:sz w:val="17"/>
+              </w:rPr>
+              <w:t>Non-graphical run</w:t>
+            </w:r>
+          </w:p>
+        </w:tc>
+        <w:tc>
+          <w:tcPr>
+            <w:tcW w:type="dxa" w:w="5486400"/>
+            <w:vAlign w:val="center"/>
+            <w:tcMar>
+              <w:top w:w="45" w:type="dxa"/>
+              <w:start w:w="65" w:type="dxa"/>
+              <w:bottom w:w="45" w:type="dxa"/>
+              <w:end w:w="65" w:type="dxa"/>
+            </w:tcMar>
+          </w:tcPr>
+          <w:p>
+            <w:pPr>
+              <w:spacing w:after="0" w:before="0" w:line="228" w:lineRule="auto"/>
+            </w:pPr>
+            <w:r>
+              <w:rPr>
+                <w:rFonts w:ascii="Aptos" w:hAnsi="Aptos"/>
+                <w:sz w:val="17"/>
+              </w:rPr>
+              <w:t>Add --no-display to image or video mode</w:t>
+            </w:r>
+          </w:p>
+        </w:tc>
+      </w:tr>
+    </w:tbl>
+    <w:p>
+      <w:pPr>
         <w:pStyle w:val="Heading1"/>
+        <w:keepNext/>
       </w:pPr>
       <w:r>
         <w:t>6. Assessment</w:t>
@@ -1377,28 +3599,40 @@
       <w:tblPr>
         <w:tblStyle w:val="TableGrid"/>
         <w:tblW w:type="auto" w:w="0"/>
-        <w:jc w:val="center"/>
+        <w:tblLayout w:type="fixed"/>
         <w:tblLook w:firstColumn="1" w:firstRow="1" w:lastColumn="0" w:lastRow="0" w:noHBand="0" w:noVBand="1" w:val="04A0"/>
       </w:tblPr>
       <w:tblGrid>
-        <w:gridCol w:w="3360"/>
-        <w:gridCol w:w="3360"/>
-        <w:gridCol w:w="3360"/>
+        <w:gridCol w:w="3456"/>
+        <w:gridCol w:w="3456"/>
+        <w:gridCol w:w="3456"/>
       </w:tblGrid>
       <w:tr>
         <w:trPr>
+          <w:trHeight w:hRule="atLeast"/>
           <w:tblHeader w:val="true"/>
         </w:trPr>
         <w:tc>
           <w:tcPr>
-            <w:tcW w:type="dxa" w:w="4896"/>
+            <w:tcW w:type="dxa" w:w="3657600"/>
+            <w:vAlign w:val="center"/>
+            <w:tcMar>
+              <w:top w:w="45" w:type="dxa"/>
+              <w:start w:w="65" w:type="dxa"/>
+              <w:bottom w:w="45" w:type="dxa"/>
+              <w:end w:w="65" w:type="dxa"/>
+            </w:tcMar>
             <w:shd w:fill="D9EAF7"/>
-            <w:vAlign w:val="center"/>
           </w:tcPr>
           <w:p>
+            <w:pPr>
+              <w:spacing w:after="0" w:before="0" w:line="228" w:lineRule="auto"/>
+            </w:pPr>
             <w:r>
               <w:rPr>
+                <w:rFonts w:ascii="Aptos" w:hAnsi="Aptos"/>
                 <w:b/>
+                <w:sz w:val="17"/>
               </w:rPr>
               <w:t>Deliverable</w:t>
             </w:r>
@@ -1406,14 +3640,25 @@
         </w:tc>
         <w:tc>
           <w:tcPr>
-            <w:tcW w:type="dxa" w:w="3600"/>
+            <w:tcW w:type="dxa" w:w="2286000"/>
+            <w:vAlign w:val="center"/>
+            <w:tcMar>
+              <w:top w:w="45" w:type="dxa"/>
+              <w:start w:w="65" w:type="dxa"/>
+              <w:bottom w:w="45" w:type="dxa"/>
+              <w:end w:w="65" w:type="dxa"/>
+            </w:tcMar>
             <w:shd w:fill="D9EAF7"/>
-            <w:vAlign w:val="center"/>
           </w:tcPr>
           <w:p>
+            <w:pPr>
+              <w:spacing w:after="0" w:before="0" w:line="228" w:lineRule="auto"/>
+            </w:pPr>
             <w:r>
               <w:rPr>
+                <w:rFonts w:ascii="Aptos" w:hAnsi="Aptos"/>
                 <w:b/>
+                <w:sz w:val="17"/>
               </w:rPr>
               <w:t>Questions</w:t>
             </w:r>
@@ -1421,14 +3666,25 @@
         </w:tc>
         <w:tc>
           <w:tcPr>
-            <w:tcW w:type="dxa" w:w="1440"/>
+            <w:tcW w:type="dxa" w:w="1371600"/>
+            <w:vAlign w:val="center"/>
+            <w:tcMar>
+              <w:top w:w="45" w:type="dxa"/>
+              <w:start w:w="65" w:type="dxa"/>
+              <w:bottom w:w="45" w:type="dxa"/>
+              <w:end w:w="65" w:type="dxa"/>
+            </w:tcMar>
             <w:shd w:fill="D9EAF7"/>
-            <w:vAlign w:val="center"/>
           </w:tcPr>
           <w:p>
+            <w:pPr>
+              <w:spacing w:after="0" w:before="0" w:line="228" w:lineRule="auto"/>
+            </w:pPr>
             <w:r>
               <w:rPr>
+                <w:rFonts w:ascii="Aptos" w:hAnsi="Aptos"/>
                 <w:b/>
+                <w:sz w:val="17"/>
               </w:rPr>
               <w:t>Marks</w:t>
             </w:r>
@@ -1436,115 +3692,241 @@
         </w:tc>
       </w:tr>
       <w:tr>
+        <w:trPr>
+          <w:trHeight w:hRule="atLeast"/>
+        </w:trPr>
         <w:tc>
           <w:tcPr>
-            <w:tcW w:type="dxa" w:w="4896"/>
+            <w:tcW w:type="dxa" w:w="3657600"/>
             <w:vAlign w:val="center"/>
+            <w:tcMar>
+              <w:top w:w="45" w:type="dxa"/>
+              <w:start w:w="65" w:type="dxa"/>
+              <w:bottom w:w="45" w:type="dxa"/>
+              <w:end w:w="65" w:type="dxa"/>
+            </w:tcMar>
           </w:tcPr>
           <w:p>
+            <w:pPr>
+              <w:spacing w:after="0" w:before="0" w:line="228" w:lineRule="auto"/>
+            </w:pPr>
             <w:r>
+              <w:rPr>
+                <w:rFonts w:ascii="Aptos" w:hAnsi="Aptos"/>
+                <w:sz w:val="17"/>
+              </w:rPr>
               <w:t>Session 1 completed Colab PDF</w:t>
             </w:r>
           </w:p>
         </w:tc>
         <w:tc>
           <w:tcPr>
-            <w:tcW w:type="dxa" w:w="3600"/>
+            <w:tcW w:type="dxa" w:w="2286000"/>
             <w:vAlign w:val="center"/>
+            <w:tcMar>
+              <w:top w:w="45" w:type="dxa"/>
+              <w:start w:w="65" w:type="dxa"/>
+              <w:bottom w:w="45" w:type="dxa"/>
+              <w:end w:w="65" w:type="dxa"/>
+            </w:tcMar>
           </w:tcPr>
           <w:p>
+            <w:pPr>
+              <w:spacing w:after="0" w:before="0" w:line="228" w:lineRule="auto"/>
+            </w:pPr>
             <w:r>
+              <w:rPr>
+                <w:rFonts w:ascii="Aptos" w:hAnsi="Aptos"/>
+                <w:sz w:val="17"/>
+              </w:rPr>
               <w:t>27 embedded questions</w:t>
             </w:r>
           </w:p>
         </w:tc>
         <w:tc>
           <w:tcPr>
-            <w:tcW w:type="dxa" w:w="1440"/>
+            <w:tcW w:type="dxa" w:w="1371600"/>
             <w:vAlign w:val="center"/>
+            <w:tcMar>
+              <w:top w:w="45" w:type="dxa"/>
+              <w:start w:w="65" w:type="dxa"/>
+              <w:bottom w:w="45" w:type="dxa"/>
+              <w:end w:w="65" w:type="dxa"/>
+            </w:tcMar>
           </w:tcPr>
           <w:p>
+            <w:pPr>
+              <w:spacing w:after="0" w:before="0" w:line="228" w:lineRule="auto"/>
+            </w:pPr>
             <w:r>
+              <w:rPr>
+                <w:rFonts w:ascii="Aptos" w:hAnsi="Aptos"/>
+                <w:sz w:val="17"/>
+              </w:rPr>
               <w:t>60</w:t>
             </w:r>
           </w:p>
         </w:tc>
       </w:tr>
       <w:tr>
+        <w:trPr>
+          <w:trHeight w:hRule="atLeast"/>
+        </w:trPr>
         <w:tc>
           <w:tcPr>
-            <w:tcW w:type="dxa" w:w="4896"/>
+            <w:tcW w:type="dxa" w:w="3657600"/>
             <w:vAlign w:val="center"/>
+            <w:tcMar>
+              <w:top w:w="45" w:type="dxa"/>
+              <w:start w:w="65" w:type="dxa"/>
+              <w:bottom w:w="45" w:type="dxa"/>
+              <w:end w:w="65" w:type="dxa"/>
+            </w:tcMar>
           </w:tcPr>
           <w:p>
+            <w:pPr>
+              <w:spacing w:after="0" w:before="0" w:line="228" w:lineRule="auto"/>
+            </w:pPr>
             <w:r>
+              <w:rPr>
+                <w:rFonts w:ascii="Aptos" w:hAnsi="Aptos"/>
+                <w:sz w:val="17"/>
+              </w:rPr>
               <w:t>Session 2 completed Colab PDF</w:t>
             </w:r>
           </w:p>
         </w:tc>
         <w:tc>
           <w:tcPr>
-            <w:tcW w:type="dxa" w:w="3600"/>
+            <w:tcW w:type="dxa" w:w="2286000"/>
             <w:vAlign w:val="center"/>
+            <w:tcMar>
+              <w:top w:w="45" w:type="dxa"/>
+              <w:start w:w="65" w:type="dxa"/>
+              <w:bottom w:w="45" w:type="dxa"/>
+              <w:end w:w="65" w:type="dxa"/>
+            </w:tcMar>
           </w:tcPr>
           <w:p>
+            <w:pPr>
+              <w:spacing w:after="0" w:before="0" w:line="228" w:lineRule="auto"/>
+            </w:pPr>
             <w:r>
+              <w:rPr>
+                <w:rFonts w:ascii="Aptos" w:hAnsi="Aptos"/>
+                <w:sz w:val="17"/>
+              </w:rPr>
               <w:t>20 embedded questions</w:t>
             </w:r>
           </w:p>
         </w:tc>
         <w:tc>
           <w:tcPr>
-            <w:tcW w:type="dxa" w:w="1440"/>
+            <w:tcW w:type="dxa" w:w="1371600"/>
             <w:vAlign w:val="center"/>
+            <w:tcMar>
+              <w:top w:w="45" w:type="dxa"/>
+              <w:start w:w="65" w:type="dxa"/>
+              <w:bottom w:w="45" w:type="dxa"/>
+              <w:end w:w="65" w:type="dxa"/>
+            </w:tcMar>
           </w:tcPr>
           <w:p>
+            <w:pPr>
+              <w:spacing w:after="0" w:before="0" w:line="228" w:lineRule="auto"/>
+            </w:pPr>
             <w:r>
+              <w:rPr>
+                <w:rFonts w:ascii="Aptos" w:hAnsi="Aptos"/>
+                <w:sz w:val="17"/>
+              </w:rPr>
               <w:t>40</w:t>
             </w:r>
           </w:p>
         </w:tc>
       </w:tr>
       <w:tr>
+        <w:trPr>
+          <w:trHeight w:hRule="atLeast"/>
+        </w:trPr>
         <w:tc>
           <w:tcPr>
-            <w:tcW w:type="dxa" w:w="4896"/>
+            <w:tcW w:type="dxa" w:w="3657600"/>
             <w:vAlign w:val="center"/>
+            <w:tcMar>
+              <w:top w:w="45" w:type="dxa"/>
+              <w:start w:w="65" w:type="dxa"/>
+              <w:bottom w:w="45" w:type="dxa"/>
+              <w:end w:w="65" w:type="dxa"/>
+            </w:tcMar>
           </w:tcPr>
           <w:p>
+            <w:pPr>
+              <w:spacing w:after="0" w:before="0" w:line="228" w:lineRule="auto"/>
+            </w:pPr>
             <w:r>
+              <w:rPr>
+                <w:rFonts w:ascii="Aptos" w:hAnsi="Aptos"/>
+                <w:sz w:val="17"/>
+              </w:rPr>
               <w:t>Total</w:t>
             </w:r>
           </w:p>
         </w:tc>
         <w:tc>
           <w:tcPr>
-            <w:tcW w:type="dxa" w:w="3600"/>
+            <w:tcW w:type="dxa" w:w="2286000"/>
             <w:vAlign w:val="center"/>
+            <w:tcMar>
+              <w:top w:w="45" w:type="dxa"/>
+              <w:start w:w="65" w:type="dxa"/>
+              <w:bottom w:w="45" w:type="dxa"/>
+              <w:end w:w="65" w:type="dxa"/>
+            </w:tcMar>
           </w:tcPr>
           <w:p>
+            <w:pPr>
+              <w:spacing w:after="0" w:before="0" w:line="228" w:lineRule="auto"/>
+            </w:pPr>
             <w:r>
+              <w:rPr>
+                <w:rFonts w:ascii="Aptos" w:hAnsi="Aptos"/>
+                <w:sz w:val="17"/>
+              </w:rPr>
               <w:t>47 embedded questions</w:t>
             </w:r>
           </w:p>
         </w:tc>
         <w:tc>
           <w:tcPr>
-            <w:tcW w:type="dxa" w:w="1440"/>
+            <w:tcW w:type="dxa" w:w="1371600"/>
             <w:vAlign w:val="center"/>
+            <w:tcMar>
+              <w:top w:w="45" w:type="dxa"/>
+              <w:start w:w="65" w:type="dxa"/>
+              <w:bottom w:w="45" w:type="dxa"/>
+              <w:end w:w="65" w:type="dxa"/>
+            </w:tcMar>
           </w:tcPr>
           <w:p>
+            <w:pPr>
+              <w:spacing w:after="0" w:before="0" w:line="228" w:lineRule="auto"/>
+            </w:pPr>
             <w:r>
+              <w:rPr>
+                <w:rFonts w:ascii="Aptos" w:hAnsi="Aptos"/>
+                <w:sz w:val="17"/>
+              </w:rPr>
               <w:t>100</w:t>
             </w:r>
           </w:p>
         </w:tc>
       </w:tr>
     </w:tbl>
-    <w:p/>
     <w:p>
       <w:pPr>
         <w:pStyle w:val="Heading2"/>
+        <w:keepNext/>
       </w:pPr>
       <w:r>
         <w:t>6.1 Evidence policy</w:t>
@@ -1552,12 +3934,13 @@
     </w:p>
     <w:p>
       <w:r>
-        <w:t>Questions are marked together with the relevant output. An answer unsupported by the required code output, metric plot, screenshot, photograph, or result table may receive reduced credit.</w:t>
+        <w:t>Questions are marked together with the relevant output. An answer unsupported by the required code output, metric plot, screenshot, photograph, saved image, annotated video, JSON summary, CSV record, or result table may receive reduced credit.</w:t>
       </w:r>
     </w:p>
     <w:p>
       <w:pPr>
         <w:pStyle w:val="Heading1"/>
+        <w:keepNext/>
       </w:pPr>
       <w:r>
         <w:t>7. Instructor preparation checklist</w:t>
@@ -1566,14 +3949,18 @@
     <w:p>
       <w:pPr>
         <w:pStyle w:val="ListBullet"/>
+        <w:keepLines/>
+        <w:spacing w:after="20"/>
       </w:pPr>
       <w:r>
-        <w:t>Insert the final dataset and validation files.</w:t>
+        <w:t>Insert the final dataset, validation images, and at least one short validation video.</w:t>
       </w:r>
     </w:p>
     <w:p>
       <w:pPr>
         <w:pStyle w:val="ListBullet"/>
+        <w:keepLines/>
+        <w:spacing w:after="20"/>
       </w:pPr>
       <w:r>
         <w:t>Verify every image-label pair and the intended class mapping.</w:t>
@@ -1582,6 +3969,8 @@
     <w:p>
       <w:pPr>
         <w:pStyle w:val="ListBullet"/>
+        <w:keepLines/>
+        <w:spacing w:after="20"/>
       </w:pPr>
       <w:r>
         <w:t>Test the full Session 1 notebook in a temporary student fork.</w:t>
@@ -1590,46 +3979,112 @@
     <w:p>
       <w:pPr>
         <w:pStyle w:val="ListBullet"/>
+        <w:keepLines/>
+        <w:spacing w:after="20"/>
       </w:pPr>
       <w:r>
-        <w:t>Test .pt and ONNX loading on the actual Pi 5 kits.</w:t>
+        <w:t>Repair any pending apt/dpkg/DKMS errors before class; students must not repair system packages during the lab.</w:t>
       </w:r>
     </w:p>
     <w:p>
       <w:pPr>
         <w:pStyle w:val="ListBullet"/>
+        <w:keepLines/>
+        <w:spacing w:after="20"/>
       </w:pPr>
       <w:r>
-        <w:t>Test the USB webcam index, focus, lighting, and local GUI window.</w:t>
+        <w:t>Confirm python3 -m venv works and the CPU-only PyTorch index is reachable.</w:t>
       </w:r>
     </w:p>
     <w:p>
       <w:pPr>
         <w:pStyle w:val="ListBullet"/>
+        <w:keepLines/>
+        <w:spacing w:after="20"/>
       </w:pPr>
       <w:r>
-        <w:t>Confirm each group creates a fork before the session begins.</w:t>
+        <w:t>Verify that the CPU-only check passes even when nvidia-ml-py is installed.</w:t>
       </w:r>
     </w:p>
     <w:p>
       <w:pPr>
         <w:pStyle w:val="ListBullet"/>
+        <w:keepLines/>
+        <w:spacing w:after="20"/>
       </w:pPr>
       <w:r>
-        <w:t>Freeze the upstream repository before students fork it.</w:t>
+        <w:t>Confirm shared/models/yolo26n.pt and the updated deployment script are committed to upstream main.</w:t>
       </w:r>
     </w:p>
     <w:p>
       <w:pPr>
         <w:pStyle w:val="ListBullet"/>
+        <w:keepLines/>
+        <w:spacing w:after="20"/>
       </w:pPr>
       <w:r>
-        <w:t>Keep backup trained models and one backup Pi kit available.</w:t>
+        <w:t>Test --scan-cameras on every Pi kit and record at least one working USB-webcam index.</w:t>
+      </w:r>
+    </w:p>
+    <w:p>
+      <w:pPr>
+        <w:pStyle w:val="ListBullet"/>
+        <w:keepLines/>
+        <w:spacing w:after="20"/>
+      </w:pPr>
+      <w:r>
+        <w:t>Test the 760 x 420 preview, window movement, keyboard controls, and --no-display mode.</w:t>
+      </w:r>
+    </w:p>
+    <w:p>
+      <w:pPr>
+        <w:pStyle w:val="ListBullet"/>
+        <w:keepLines/>
+        <w:spacing w:after="20"/>
+      </w:pPr>
+      <w:r>
+        <w:t>Test static-image, recorded-video, live-webcam, .pt, and ONNX inference on the actual Pi 5 kits.</w:t>
+      </w:r>
+    </w:p>
+    <w:p>
+      <w:pPr>
+        <w:pStyle w:val="ListBullet"/>
+        <w:keepLines/>
+        <w:spacing w:after="20"/>
+      </w:pPr>
+      <w:r>
+        <w:t>Confirm that video validation produces an annotated video, JSON summary, and frame-metrics CSV.</w:t>
+      </w:r>
+    </w:p>
+    <w:p>
+      <w:pPr>
+        <w:pStyle w:val="ListBullet"/>
+        <w:keepLines/>
+        <w:spacing w:after="20"/>
+      </w:pPr>
+      <w:r>
+        <w:t>Freeze the upstream main branch after the final update and tell each group to synchronize its fork.</w:t>
+      </w:r>
+    </w:p>
+    <w:p>
+      <w:pPr>
+        <w:pStyle w:val="ListBullet"/>
+        <w:keepLines/>
+        <w:spacing w:after="20"/>
+      </w:pPr>
+      <w:r>
+        <w:t>Keep backup trained models, one backup USB webcam, and one backup Pi kit available.</w:t>
+      </w:r>
+    </w:p>
+    <w:p>
+      <w:r>
+        <w:br w:type="page"/>
       </w:r>
     </w:p>
     <w:p>
       <w:pPr>
         <w:pStyle w:val="Heading1"/>
+        <w:keepNext/>
       </w:pPr>
       <w:r>
         <w:t>8. Submission checklist</w:t>
@@ -1638,22 +4093,48 @@
     <w:p>
       <w:pPr>
         <w:pStyle w:val="ListBullet"/>
+        <w:keepLines/>
+        <w:spacing w:after="20"/>
       </w:pPr>
       <w:r>
-        <w:t>Session 1 PDF contains all 27 answers, visible outputs, fork URL, and final commit ID.</w:t>
+        <w:t>Session 1 PDF contains all 27 answers, visible outputs, the group fork URL, and the Session 1 training commit ID.</w:t>
       </w:r>
     </w:p>
     <w:p>
       <w:pPr>
         <w:pStyle w:val="ListBullet"/>
+        <w:keepLines/>
+        <w:spacing w:after="20"/>
       </w:pPr>
       <w:r>
-        <w:t>Session 2 PDF contains all 20 answers, uploaded Pi evidence, fork URL, and matching commit ID.</w:t>
+        <w:t>Session 2 PDF contains all 20 answers, the synchronized commit ID, CPU-only verification, and the working camera index.</w:t>
       </w:r>
     </w:p>
     <w:p>
       <w:pPr>
         <w:pStyle w:val="ListBullet"/>
+        <w:keepLines/>
+        <w:spacing w:after="20"/>
+      </w:pPr>
+      <w:r>
+        <w:t>Session 2 evidence includes the baseline, static custom-model result, recorded-video result, live-webcam result, and .pt/ONNX comparison.</w:t>
+      </w:r>
+    </w:p>
+    <w:p>
+      <w:pPr>
+        <w:pStyle w:val="ListBullet"/>
+        <w:keepLines/>
+        <w:spacing w:after="20"/>
+      </w:pPr>
+      <w:r>
+        <w:t>The annotated video, JSON summary, and frame-metrics CSV paths are recorded in the Session 2 notebook.</w:t>
+      </w:r>
+    </w:p>
+    <w:p>
+      <w:pPr>
+        <w:pStyle w:val="ListBullet"/>
+        <w:keepLines/>
+        <w:spacing w:after="20"/>
       </w:pPr>
       <w:r>
         <w:t>No token, password, or private credential appears in either PDF.</w:t>
@@ -1662,28 +4143,440 @@
     <w:p>
       <w:pPr>
         <w:pStyle w:val="ListBullet"/>
+        <w:keepLines/>
+        <w:spacing w:after="20"/>
       </w:pPr>
       <w:r>
-        <w:t>The model files are visible in the group fork under student_work/models/.</w:t>
+        <w:t>The custom model files are visible in the group fork under student_work/models/.</w:t>
+      </w:r>
+    </w:p>
+    <w:p>
+      <w:pPr>
+        <w:pStyle w:val="ListBullet"/>
+        <w:keepLines/>
+        <w:spacing w:after="20"/>
+      </w:pPr>
+      <w:r>
+        <w:t>Student outputs remain under student_work/; instructor-managed shared/ files are unchanged in the group fork.</w:t>
       </w:r>
     </w:p>
     <w:p>
       <w:pPr>
         <w:pStyle w:val="Heading1"/>
+        <w:keepNext/>
       </w:pPr>
       <w:r>
-        <w:t>9. Reference links</w:t>
+        <w:t>9. Common Session 2 error interpretation</w:t>
+      </w:r>
+    </w:p>
+    <w:tbl>
+      <w:tblPr>
+        <w:tblStyle w:val="TableGrid"/>
+        <w:tblW w:type="auto" w:w="0"/>
+        <w:tblLayout w:type="fixed"/>
+        <w:tblLook w:firstColumn="1" w:firstRow="1" w:lastColumn="0" w:lastRow="0" w:noHBand="0" w:noVBand="1" w:val="04A0"/>
+      </w:tblPr>
+      <w:tblGrid>
+        <w:gridCol w:w="5184"/>
+        <w:gridCol w:w="5184"/>
+      </w:tblGrid>
+      <w:tr>
+        <w:trPr>
+          <w:trHeight w:hRule="atLeast"/>
+          <w:tblHeader w:val="true"/>
+        </w:trPr>
+        <w:tc>
+          <w:tcPr>
+            <w:tcW w:type="dxa" w:w="2468880"/>
+            <w:vAlign w:val="center"/>
+            <w:tcMar>
+              <w:top w:w="45" w:type="dxa"/>
+              <w:start w:w="65" w:type="dxa"/>
+              <w:bottom w:w="45" w:type="dxa"/>
+              <w:end w:w="65" w:type="dxa"/>
+            </w:tcMar>
+            <w:shd w:fill="D9EAF7"/>
+          </w:tcPr>
+          <w:p>
+            <w:pPr>
+              <w:spacing w:after="0" w:before="0" w:line="228" w:lineRule="auto"/>
+            </w:pPr>
+            <w:r>
+              <w:rPr>
+                <w:rFonts w:ascii="Aptos" w:hAnsi="Aptos"/>
+                <w:b/>
+                <w:sz w:val="17"/>
+              </w:rPr>
+              <w:t>Observation</w:t>
+            </w:r>
+          </w:p>
+        </w:tc>
+        <w:tc>
+          <w:tcPr>
+            <w:tcW w:type="dxa" w:w="4846320"/>
+            <w:vAlign w:val="center"/>
+            <w:tcMar>
+              <w:top w:w="45" w:type="dxa"/>
+              <w:start w:w="65" w:type="dxa"/>
+              <w:bottom w:w="45" w:type="dxa"/>
+              <w:end w:w="65" w:type="dxa"/>
+            </w:tcMar>
+            <w:shd w:fill="D9EAF7"/>
+          </w:tcPr>
+          <w:p>
+            <w:pPr>
+              <w:spacing w:after="0" w:before="0" w:line="228" w:lineRule="auto"/>
+            </w:pPr>
+            <w:r>
+              <w:rPr>
+                <w:rFonts w:ascii="Aptos" w:hAnsi="Aptos"/>
+                <w:b/>
+                <w:sz w:val="17"/>
+              </w:rPr>
+              <w:t>Correct interpretation/action</w:t>
+            </w:r>
+          </w:p>
+        </w:tc>
+      </w:tr>
+      <w:tr>
+        <w:trPr>
+          <w:trHeight w:hRule="atLeast"/>
+        </w:trPr>
+        <w:tc>
+          <w:tcPr>
+            <w:tcW w:type="dxa" w:w="2468880"/>
+            <w:vAlign w:val="center"/>
+            <w:tcMar>
+              <w:top w:w="45" w:type="dxa"/>
+              <w:start w:w="65" w:type="dxa"/>
+              <w:bottom w:w="45" w:type="dxa"/>
+              <w:end w:w="65" w:type="dxa"/>
+            </w:tcMar>
+          </w:tcPr>
+          <w:p>
+            <w:pPr>
+              <w:spacing w:after="0" w:before="0" w:line="228" w:lineRule="auto"/>
+            </w:pPr>
+            <w:r>
+              <w:rPr>
+                <w:rFonts w:ascii="Aptos" w:hAnsi="Aptos"/>
+                <w:sz w:val="17"/>
+              </w:rPr>
+              <w:t>nvidia-ml-py is listed</w:t>
+            </w:r>
+          </w:p>
+        </w:tc>
+        <w:tc>
+          <w:tcPr>
+            <w:tcW w:type="dxa" w:w="4846320"/>
+            <w:vAlign w:val="center"/>
+            <w:tcMar>
+              <w:top w:w="45" w:type="dxa"/>
+              <w:start w:w="65" w:type="dxa"/>
+              <w:bottom w:w="45" w:type="dxa"/>
+              <w:end w:w="65" w:type="dxa"/>
+            </w:tcMar>
+          </w:tcPr>
+          <w:p>
+            <w:pPr>
+              <w:spacing w:after="0" w:before="0" w:line="228" w:lineRule="auto"/>
+            </w:pPr>
+            <w:r>
+              <w:rPr>
+                <w:rFonts w:ascii="Aptos" w:hAnsi="Aptos"/>
+                <w:sz w:val="17"/>
+              </w:rPr>
+              <w:t>Allowed. Confirm torch.cuda.is_available() is False and torch.version.cuda is None.</w:t>
+            </w:r>
+          </w:p>
+        </w:tc>
+      </w:tr>
+      <w:tr>
+        <w:trPr>
+          <w:trHeight w:hRule="atLeast"/>
+        </w:trPr>
+        <w:tc>
+          <w:tcPr>
+            <w:tcW w:type="dxa" w:w="2468880"/>
+            <w:vAlign w:val="center"/>
+            <w:tcMar>
+              <w:top w:w="45" w:type="dxa"/>
+              <w:start w:w="65" w:type="dxa"/>
+              <w:bottom w:w="45" w:type="dxa"/>
+              <w:end w:w="65" w:type="dxa"/>
+            </w:tcMar>
+          </w:tcPr>
+          <w:p>
+            <w:pPr>
+              <w:spacing w:after="0" w:before="0" w:line="228" w:lineRule="auto"/>
+            </w:pPr>
+            <w:r>
+              <w:rPr>
+                <w:rFonts w:ascii="Aptos" w:hAnsi="Aptos"/>
+                <w:sz w:val="17"/>
+              </w:rPr>
+              <w:t>8812au/DKMS or dpkg error during apt</w:t>
+            </w:r>
+          </w:p>
+        </w:tc>
+        <w:tc>
+          <w:tcPr>
+            <w:tcW w:type="dxa" w:w="4846320"/>
+            <w:vAlign w:val="center"/>
+            <w:tcMar>
+              <w:top w:w="45" w:type="dxa"/>
+              <w:start w:w="65" w:type="dxa"/>
+              <w:bottom w:w="45" w:type="dxa"/>
+              <w:end w:w="65" w:type="dxa"/>
+            </w:tcMar>
+          </w:tcPr>
+          <w:p>
+            <w:pPr>
+              <w:spacing w:after="0" w:before="0" w:line="228" w:lineRule="auto"/>
+            </w:pPr>
+            <w:r>
+              <w:rPr>
+                <w:rFonts w:ascii="Aptos" w:hAnsi="Aptos"/>
+                <w:sz w:val="17"/>
+              </w:rPr>
+              <w:t>System-level driver problem. Stop student installation and ask the instructor to repair the Pi.</w:t>
+            </w:r>
+          </w:p>
+        </w:tc>
+      </w:tr>
+      <w:tr>
+        <w:trPr>
+          <w:trHeight w:hRule="atLeast"/>
+        </w:trPr>
+        <w:tc>
+          <w:tcPr>
+            <w:tcW w:type="dxa" w:w="2468880"/>
+            <w:vAlign w:val="center"/>
+            <w:tcMar>
+              <w:top w:w="45" w:type="dxa"/>
+              <w:start w:w="65" w:type="dxa"/>
+              <w:bottom w:w="45" w:type="dxa"/>
+              <w:end w:w="65" w:type="dxa"/>
+            </w:tcMar>
+          </w:tcPr>
+          <w:p>
+            <w:pPr>
+              <w:spacing w:after="0" w:before="0" w:line="228" w:lineRule="auto"/>
+            </w:pPr>
+            <w:r>
+              <w:rPr>
+                <w:rFonts w:ascii="Aptos" w:hAnsi="Aptos"/>
+                <w:sz w:val="17"/>
+              </w:rPr>
+              <w:t>No /dev/video0</w:t>
+            </w:r>
+          </w:p>
+        </w:tc>
+        <w:tc>
+          <w:tcPr>
+            <w:tcW w:type="dxa" w:w="4846320"/>
+            <w:vAlign w:val="center"/>
+            <w:tcMar>
+              <w:top w:w="45" w:type="dxa"/>
+              <w:start w:w="65" w:type="dxa"/>
+              <w:bottom w:w="45" w:type="dxa"/>
+              <w:end w:w="65" w:type="dxa"/>
+            </w:tcMar>
+          </w:tcPr>
+          <w:p>
+            <w:pPr>
+              <w:spacing w:after="0" w:before="0" w:line="228" w:lineRule="auto"/>
+            </w:pPr>
+            <w:r>
+              <w:rPr>
+                <w:rFonts w:ascii="Aptos" w:hAnsi="Aptos"/>
+                <w:sz w:val="17"/>
+              </w:rPr>
+              <w:t>Run --scan-cameras; the working USB webcam may use another index.</w:t>
+            </w:r>
+          </w:p>
+        </w:tc>
+      </w:tr>
+      <w:tr>
+        <w:trPr>
+          <w:trHeight w:hRule="atLeast"/>
+        </w:trPr>
+        <w:tc>
+          <w:tcPr>
+            <w:tcW w:type="dxa" w:w="2468880"/>
+            <w:vAlign w:val="center"/>
+            <w:tcMar>
+              <w:top w:w="45" w:type="dxa"/>
+              <w:start w:w="65" w:type="dxa"/>
+              <w:bottom w:w="45" w:type="dxa"/>
+              <w:end w:w="65" w:type="dxa"/>
+            </w:tcMar>
+          </w:tcPr>
+          <w:p>
+            <w:pPr>
+              <w:spacing w:after="0" w:before="0" w:line="228" w:lineRule="auto"/>
+            </w:pPr>
+            <w:r>
+              <w:rPr>
+                <w:rFonts w:ascii="Aptos" w:hAnsi="Aptos"/>
+                <w:sz w:val="17"/>
+              </w:rPr>
+              <w:t>Static image window appears frozen/off-screen</w:t>
+            </w:r>
+          </w:p>
+        </w:tc>
+        <w:tc>
+          <w:tcPr>
+            <w:tcW w:type="dxa" w:w="4846320"/>
+            <w:vAlign w:val="center"/>
+            <w:tcMar>
+              <w:top w:w="45" w:type="dxa"/>
+              <w:start w:w="65" w:type="dxa"/>
+              <w:bottom w:w="45" w:type="dxa"/>
+              <w:end w:w="65" w:type="dxa"/>
+            </w:tcMar>
+          </w:tcPr>
+          <w:p>
+            <w:pPr>
+              <w:spacing w:after="0" w:before="0" w:line="228" w:lineRule="auto"/>
+            </w:pPr>
+            <w:r>
+              <w:rPr>
+                <w:rFonts w:ascii="Aptos" w:hAnsi="Aptos"/>
+                <w:sz w:val="17"/>
+              </w:rPr>
+              <w:t>Use the v9 script with fitted WINDOW_NORMAL preview, or run with --no-display.</w:t>
+            </w:r>
+          </w:p>
+        </w:tc>
+      </w:tr>
+      <w:tr>
+        <w:trPr>
+          <w:trHeight w:hRule="atLeast"/>
+        </w:trPr>
+        <w:tc>
+          <w:tcPr>
+            <w:tcW w:type="dxa" w:w="2468880"/>
+            <w:vAlign w:val="center"/>
+            <w:tcMar>
+              <w:top w:w="45" w:type="dxa"/>
+              <w:start w:w="65" w:type="dxa"/>
+              <w:bottom w:w="45" w:type="dxa"/>
+              <w:end w:w="65" w:type="dxa"/>
+            </w:tcMar>
+          </w:tcPr>
+          <w:p>
+            <w:pPr>
+              <w:spacing w:after="0" w:before="0" w:line="228" w:lineRule="auto"/>
+            </w:pPr>
+            <w:r>
+              <w:rPr>
+                <w:rFonts w:ascii="Aptos" w:hAnsi="Aptos"/>
+                <w:sz w:val="17"/>
+              </w:rPr>
+              <w:t>No validation video is listed</w:t>
+            </w:r>
+          </w:p>
+        </w:tc>
+        <w:tc>
+          <w:tcPr>
+            <w:tcW w:type="dxa" w:w="4846320"/>
+            <w:vAlign w:val="center"/>
+            <w:tcMar>
+              <w:top w:w="45" w:type="dxa"/>
+              <w:start w:w="65" w:type="dxa"/>
+              <w:bottom w:w="45" w:type="dxa"/>
+              <w:end w:w="65" w:type="dxa"/>
+            </w:tcMar>
+          </w:tcPr>
+          <w:p>
+            <w:pPr>
+              <w:spacing w:after="0" w:before="0" w:line="228" w:lineRule="auto"/>
+            </w:pPr>
+            <w:r>
+              <w:rPr>
+                <w:rFonts w:ascii="Aptos" w:hAnsi="Aptos"/>
+                <w:sz w:val="17"/>
+              </w:rPr>
+              <w:t>The instructor repository is incomplete or the fork was not synchronized.</w:t>
+            </w:r>
+          </w:p>
+        </w:tc>
+      </w:tr>
+      <w:tr>
+        <w:trPr>
+          <w:trHeight w:hRule="atLeast"/>
+        </w:trPr>
+        <w:tc>
+          <w:tcPr>
+            <w:tcW w:type="dxa" w:w="2468880"/>
+            <w:vAlign w:val="center"/>
+            <w:tcMar>
+              <w:top w:w="45" w:type="dxa"/>
+              <w:start w:w="65" w:type="dxa"/>
+              <w:bottom w:w="45" w:type="dxa"/>
+              <w:end w:w="65" w:type="dxa"/>
+            </w:tcMar>
+          </w:tcPr>
+          <w:p>
+            <w:pPr>
+              <w:spacing w:after="0" w:before="0" w:line="228" w:lineRule="auto"/>
+            </w:pPr>
+            <w:r>
+              <w:rPr>
+                <w:rFonts w:ascii="Aptos" w:hAnsi="Aptos"/>
+                <w:sz w:val="17"/>
+              </w:rPr>
+              <w:t>--video-index or --scan-cameras is unrecognized</w:t>
+            </w:r>
+          </w:p>
+        </w:tc>
+        <w:tc>
+          <w:tcPr>
+            <w:tcW w:type="dxa" w:w="4846320"/>
+            <w:vAlign w:val="center"/>
+            <w:tcMar>
+              <w:top w:w="45" w:type="dxa"/>
+              <w:start w:w="65" w:type="dxa"/>
+              <w:bottom w:w="45" w:type="dxa"/>
+              <w:end w:w="65" w:type="dxa"/>
+            </w:tcMar>
+          </w:tcPr>
+          <w:p>
+            <w:pPr>
+              <w:spacing w:after="0" w:before="0" w:line="228" w:lineRule="auto"/>
+            </w:pPr>
+            <w:r>
+              <w:rPr>
+                <w:rFonts w:ascii="Aptos" w:hAnsi="Aptos"/>
+                <w:sz w:val="17"/>
+              </w:rPr>
+              <w:t>The group fork contains an older deployment script; synchronize the fork and clone/pull again.</w:t>
+            </w:r>
+          </w:p>
+        </w:tc>
+      </w:tr>
+    </w:tbl>
+    <w:p>
+      <w:pPr>
+        <w:pStyle w:val="Heading1"/>
+        <w:keepNext/>
+      </w:pPr>
+      <w:r>
+        <w:t>10. Reference links</w:t>
       </w:r>
     </w:p>
     <w:p>
       <w:pPr>
         <w:pStyle w:val="ListBullet"/>
+        <w:keepLines/>
+        <w:spacing w:after="20"/>
       </w:pPr>
       <w:r>
         <w:rPr>
           <w:b/>
         </w:rPr>
-        <w:t xml:space="preserve">GitHub: Fork a repository: </w:t>
+        <w:t xml:space="preserve">GitHub - Fork a repository: </w:t>
       </w:r>
       <w:r>
         <w:t>https://docs.github.com/en/pull-requests/how-tos/work-with-forks/fork-a-repo</w:t>
@@ -1692,12 +4585,30 @@
     <w:p>
       <w:pPr>
         <w:pStyle w:val="ListBullet"/>
+        <w:keepLines/>
+        <w:spacing w:after="20"/>
       </w:pPr>
       <w:r>
         <w:rPr>
           <w:b/>
         </w:rPr>
-        <w:t xml:space="preserve">GitHub: Personal access tokens: </w:t>
+        <w:t xml:space="preserve">GitHub - Syncing a fork: </w:t>
+      </w:r>
+      <w:r>
+        <w:t>https://docs.github.com/en/pull-requests/collaborating-with-pull-requests/working-with-forks/syncing-a-fork</w:t>
+      </w:r>
+    </w:p>
+    <w:p>
+      <w:pPr>
+        <w:pStyle w:val="ListBullet"/>
+        <w:keepLines/>
+        <w:spacing w:after="20"/>
+      </w:pPr>
+      <w:r>
+        <w:rPr>
+          <w:b/>
+        </w:rPr>
+        <w:t xml:space="preserve">GitHub - Personal access tokens: </w:t>
       </w:r>
       <w:r>
         <w:t>https://docs.github.com/en/authentication/keeping-your-account-and-data-secure/managing-your-personal-access-tokens</w:t>
@@ -1706,12 +4617,46 @@
     <w:p>
       <w:pPr>
         <w:pStyle w:val="ListBullet"/>
+        <w:keepLines/>
+        <w:spacing w:after="20"/>
       </w:pPr>
       <w:r>
         <w:rPr>
           <w:b/>
         </w:rPr>
-        <w:t xml:space="preserve">Ultralytics: Model export: </w:t>
+        <w:t xml:space="preserve">PyTorch - Start locally: </w:t>
+      </w:r>
+      <w:r>
+        <w:t>https://pytorch.org/get-started/locally/</w:t>
+      </w:r>
+    </w:p>
+    <w:p>
+      <w:pPr>
+        <w:pStyle w:val="ListBullet"/>
+        <w:keepLines/>
+        <w:spacing w:after="20"/>
+      </w:pPr>
+      <w:r>
+        <w:rPr>
+          <w:b/>
+        </w:rPr>
+        <w:t xml:space="preserve">Ultralytics - Quickstart: </w:t>
+      </w:r>
+      <w:r>
+        <w:t>https://docs.ultralytics.com/quickstart/</w:t>
+      </w:r>
+    </w:p>
+    <w:p>
+      <w:pPr>
+        <w:pStyle w:val="ListBullet"/>
+        <w:keepLines/>
+        <w:spacing w:after="20"/>
+      </w:pPr>
+      <w:r>
+        <w:rPr>
+          <w:b/>
+        </w:rPr>
+        <w:t xml:space="preserve">Ultralytics - Model export: </w:t>
       </w:r>
       <w:r>
         <w:t>https://docs.ultralytics.com/modes/export/</w:t>
@@ -1720,12 +4665,14 @@
     <w:p>
       <w:pPr>
         <w:pStyle w:val="ListBullet"/>
+        <w:keepLines/>
+        <w:spacing w:after="20"/>
       </w:pPr>
       <w:r>
         <w:rPr>
           <w:b/>
         </w:rPr>
-        <w:t xml:space="preserve">Ultralytics: Raspberry Pi guide: </w:t>
+        <w:t xml:space="preserve">Ultralytics - Raspberry Pi guide: </w:t>
       </w:r>
       <w:r>
         <w:t>https://docs.ultralytics.com/guides/raspberry-pi/</w:t>
@@ -1735,7 +4682,7 @@
       <w:headerReference w:type="default" r:id="rId9"/>
       <w:footerReference w:type="default" r:id="rId10"/>
       <w:pgSz w:w="12240" w:h="15840"/>
-      <w:pgMar w:top="1008" w:right="1080" w:bottom="1008" w:left="1080" w:header="720" w:footer="720" w:gutter="0"/>
+      <w:pgMar w:top="792" w:right="936" w:bottom="792" w:left="936" w:header="360" w:footer="360" w:gutter="0"/>
       <w:cols w:space="720"/>
       <w:docGrid w:linePitch="360"/>
     </w:sectPr>
@@ -1752,6 +4699,7 @@
     </w:pPr>
     <w:r>
       <w:rPr>
+        <w:rFonts w:ascii="Aptos" w:hAnsi="Aptos"/>
         <w:sz w:val="16"/>
       </w:rPr>
       <w:t>Computer Engineering Laboratory - Session 1 and Session 2</w:t>
@@ -1769,9 +4717,10 @@
     </w:pPr>
     <w:r>
       <w:rPr>
+        <w:rFonts w:ascii="Aptos" w:hAnsi="Aptos"/>
         <w:sz w:val="16"/>
       </w:rPr>
-      <w:t>Lab 4 - Megalopa Detection | Fork Workflow</w:t>
+      <w:t>Lab 4 - Megalopa Detection | Fork Workflow | Revision v9</w:t>
     </w:r>
   </w:p>
 </w:hdr>
@@ -2140,9 +5089,12 @@
     <w:name w:val="Normal"/>
     <w:qFormat/>
     <w:rsid w:val="00FC693F"/>
+    <w:pPr>
+      <w:spacing w:after="60" w:line="240" w:lineRule="auto"/>
+    </w:pPr>
     <w:rPr>
       <w:rFonts w:ascii="Aptos" w:hAnsi="Aptos" w:eastAsia="Aptos"/>
-      <w:sz w:val="21"/>
+      <w:sz w:val="20"/>
     </w:rPr>
   </w:style>
   <w:style w:type="paragraph" w:styleId="Header">
@@ -2200,14 +5152,14 @@
     <w:pPr>
       <w:keepNext/>
       <w:keepLines/>
-      <w:spacing w:before="480" w:after="0"/>
+      <w:spacing w:before="160" w:after="60"/>
       <w:outlineLvl w:val="0"/>
     </w:pPr>
     <w:rPr>
       <w:rFonts w:asciiTheme="majorHAnsi" w:eastAsiaTheme="majorEastAsia" w:hAnsiTheme="majorHAnsi" w:cstheme="majorBidi" w:ascii="Aptos Display" w:hAnsi="Aptos Display" w:eastAsia="Aptos Display"/>
       <w:b/>
       <w:bCs/>
-      <w:color w:val="365F91" w:themeColor="accent1" w:themeShade="BF"/>
+      <w:color w:val="365F91"/>
       <w:sz w:val="28"/>
       <w:szCs w:val="28"/>
     </w:rPr>
@@ -2224,15 +5176,15 @@
     <w:pPr>
       <w:keepNext/>
       <w:keepLines/>
-      <w:spacing w:before="200" w:after="0"/>
+      <w:spacing w:before="160" w:after="60"/>
       <w:outlineLvl w:val="1"/>
     </w:pPr>
     <w:rPr>
       <w:rFonts w:asciiTheme="majorHAnsi" w:eastAsiaTheme="majorEastAsia" w:hAnsiTheme="majorHAnsi" w:cstheme="majorBidi" w:ascii="Aptos Display" w:hAnsi="Aptos Display" w:eastAsia="Aptos Display"/>
       <w:b/>
       <w:bCs/>
-      <w:color w:val="4F81BD" w:themeColor="accent1"/>
-      <w:sz w:val="26"/>
+      <w:color w:val="4F81BD"/>
+      <w:sz w:val="25"/>
       <w:szCs w:val="26"/>
     </w:rPr>
   </w:style>
@@ -13826,6 +16778,17 @@
         <w:shd w:val="clear" w:color="auto" w:fill="FBCAA2" w:themeFill="accent6" w:themeFillTint="7F"/>
       </w:tcPr>
     </w:tblStylePr>
+  </w:style>
+  <w:style w:type="paragraph" w:customStyle="1" w:styleId="LabCode">
+    <w:name w:val="Lab Code"/>
+    <w:pPr>
+      <w:spacing w:before="40" w:after="80"/>
+      <w:ind w:left="288" w:right="144"/>
+    </w:pPr>
+    <w:rPr>
+      <w:rFonts w:ascii="Liberation Mono" w:hAnsi="Liberation Mono"/>
+      <w:sz w:val="17"/>
+    </w:rPr>
   </w:style>
 </w:styles>
 </file>

</xml_diff>